<commit_message>
docs: 섹션 VIII~X 추가 - epoch 수렴과정, ML+DL 통합분석, ML+DL+LLM/RAG 향후계획
</commit_message>
<xml_diff>
--- a/Homework/DL_FactoryAutomation/산출물/상세보고서_FEMTO_RUL_20260625.docx
+++ b/Homework/DL_FactoryAutomation/산출물/상세보고서_FEMTO_RUL_20260625.docx
@@ -15089,6 +15089,3477 @@
         <w:t xml:space="preserve">  합계 = 14,976 + 9,408 + 528 + 17 = 24,929</w:t>
       </w:r>
     </w:p>
+    <w:p>
+      <w:r>
+        <w:br w:type="page"/>
+      </w:r>
+    </w:p>
+    <w:p>
+      <w:pPr>
+        <w:pStyle w:val="Heading1"/>
+      </w:pPr>
+      <w:r>
+        <w:t>VIII. Epoch 최적값 탐색 과정</w:t>
+      </w:r>
+    </w:p>
+    <w:p>
+      <w:pPr>
+        <w:pStyle w:val="Heading2"/>
+      </w:pPr>
+      <w:r>
+        <w:t>8.1 EarlyStopping 수렴 메커니즘</w:t>
+      </w:r>
+    </w:p>
+    <w:p>
+      <w:r>
+        <w:t>EarlyStopping은 val_loss가 patience 횟수 연속 개선되지 않으면 학습을 자동 중단하고 최적 epoch의 가중치를 복원합니다. LSTM 단독 실험은 patience=5, 5종 비교/튜닝 실험은 patience=7을 적용하였습니다.</w:t>
+      </w:r>
+    </w:p>
+    <w:p>
+      <w:pPr>
+        <w:pStyle w:val="Heading2"/>
+      </w:pPr>
+      <w:r>
+        <w:t>8.2 LSTM 단독 실험 - Epoch별 손실 수렴 과정</w:t>
+      </w:r>
+    </w:p>
+    <w:p>
+      <w:r>
+        <w:t>max_epochs=50 설정이나 EarlyStopping(patience=5)에 의해 실제 10 epoch에서 종료. Best val_loss=0.144659는 epoch 5에서 달성, 이후 5회 연속 미개선으로 조기 종료.</w:t>
+      </w:r>
+    </w:p>
+    <w:tbl>
+      <w:tblPr>
+        <w:tblStyle w:val="TableGrid"/>
+        <w:tblW w:type="auto" w:w="0"/>
+        <w:tblLook w:firstColumn="1" w:firstRow="1" w:lastColumn="0" w:lastRow="0" w:noHBand="0" w:noVBand="1" w:val="04A0"/>
+      </w:tblPr>
+      <w:tblGrid>
+        <w:gridCol w:w="1881"/>
+        <w:gridCol w:w="1881"/>
+        <w:gridCol w:w="1881"/>
+        <w:gridCol w:w="1881"/>
+        <w:gridCol w:w="1881"/>
+      </w:tblGrid>
+      <w:tr>
+        <w:tc>
+          <w:tcPr>
+            <w:tcW w:type="dxa" w:w="1881"/>
+            <w:shd w:val="clear" w:color="auto" w:fill="4472C4"/>
+          </w:tcPr>
+          <w:p>
+            <w:pPr>
+              <w:jc w:val="center"/>
+            </w:pPr>
+            <w:r>
+              <w:rPr>
+                <w:b/>
+                <w:color w:val="FFFFFF"/>
+              </w:rPr>
+              <w:t>Epoch</w:t>
+            </w:r>
+          </w:p>
+        </w:tc>
+        <w:tc>
+          <w:tcPr>
+            <w:tcW w:type="dxa" w:w="1881"/>
+            <w:shd w:val="clear" w:color="auto" w:fill="4472C4"/>
+          </w:tcPr>
+          <w:p>
+            <w:pPr>
+              <w:jc w:val="center"/>
+            </w:pPr>
+            <w:r>
+              <w:rPr>
+                <w:b/>
+                <w:color w:val="FFFFFF"/>
+              </w:rPr>
+              <w:t>Train Loss</w:t>
+            </w:r>
+          </w:p>
+        </w:tc>
+        <w:tc>
+          <w:tcPr>
+            <w:tcW w:type="dxa" w:w="1881"/>
+            <w:shd w:val="clear" w:color="auto" w:fill="4472C4"/>
+          </w:tcPr>
+          <w:p>
+            <w:pPr>
+              <w:jc w:val="center"/>
+            </w:pPr>
+            <w:r>
+              <w:rPr>
+                <w:b/>
+                <w:color w:val="FFFFFF"/>
+              </w:rPr>
+              <w:t>Val Loss</w:t>
+            </w:r>
+          </w:p>
+        </w:tc>
+        <w:tc>
+          <w:tcPr>
+            <w:tcW w:type="dxa" w:w="1881"/>
+            <w:shd w:val="clear" w:color="auto" w:fill="4472C4"/>
+          </w:tcPr>
+          <w:p>
+            <w:pPr>
+              <w:jc w:val="center"/>
+            </w:pPr>
+            <w:r>
+              <w:rPr>
+                <w:b/>
+                <w:color w:val="FFFFFF"/>
+              </w:rPr>
+              <w:t>상태</w:t>
+            </w:r>
+          </w:p>
+        </w:tc>
+        <w:tc>
+          <w:tcPr>
+            <w:tcW w:type="dxa" w:w="1881"/>
+            <w:shd w:val="clear" w:color="auto" w:fill="4472C4"/>
+          </w:tcPr>
+          <w:p>
+            <w:pPr>
+              <w:jc w:val="center"/>
+            </w:pPr>
+            <w:r>
+              <w:rPr>
+                <w:b/>
+                <w:color w:val="FFFFFF"/>
+              </w:rPr>
+              <w:t>비고</w:t>
+            </w:r>
+          </w:p>
+        </w:tc>
+      </w:tr>
+      <w:tr>
+        <w:tc>
+          <w:tcPr>
+            <w:tcW w:type="dxa" w:w="1881"/>
+          </w:tcPr>
+          <w:p>
+            <w:pPr>
+              <w:jc w:val="center"/>
+            </w:pPr>
+            <w:r>
+              <w:t>1</w:t>
+            </w:r>
+          </w:p>
+        </w:tc>
+        <w:tc>
+          <w:tcPr>
+            <w:tcW w:type="dxa" w:w="1881"/>
+          </w:tcPr>
+          <w:p>
+            <w:pPr>
+              <w:jc w:val="center"/>
+            </w:pPr>
+            <w:r>
+              <w:t>0.013037</w:t>
+            </w:r>
+          </w:p>
+        </w:tc>
+        <w:tc>
+          <w:tcPr>
+            <w:tcW w:type="dxa" w:w="1881"/>
+          </w:tcPr>
+          <w:p>
+            <w:pPr>
+              <w:jc w:val="center"/>
+            </w:pPr>
+            <w:r>
+              <w:t>0.234374</w:t>
+            </w:r>
+          </w:p>
+        </w:tc>
+        <w:tc>
+          <w:tcPr>
+            <w:tcW w:type="dxa" w:w="1881"/>
+          </w:tcPr>
+          <w:p>
+            <w:pPr>
+              <w:jc w:val="center"/>
+            </w:pPr>
+            <w:r>
+              <w:t>개선</w:t>
+            </w:r>
+          </w:p>
+        </w:tc>
+        <w:tc>
+          <w:tcPr>
+            <w:tcW w:type="dxa" w:w="1881"/>
+          </w:tcPr>
+          <w:p>
+            <w:pPr>
+              <w:jc w:val="center"/>
+            </w:pPr>
+            <w:r/>
+          </w:p>
+        </w:tc>
+      </w:tr>
+      <w:tr>
+        <w:tc>
+          <w:tcPr>
+            <w:tcW w:type="dxa" w:w="1881"/>
+          </w:tcPr>
+          <w:p>
+            <w:pPr>
+              <w:jc w:val="center"/>
+            </w:pPr>
+            <w:r>
+              <w:t>2</w:t>
+            </w:r>
+          </w:p>
+        </w:tc>
+        <w:tc>
+          <w:tcPr>
+            <w:tcW w:type="dxa" w:w="1881"/>
+          </w:tcPr>
+          <w:p>
+            <w:pPr>
+              <w:jc w:val="center"/>
+            </w:pPr>
+            <w:r>
+              <w:t>0.006075</w:t>
+            </w:r>
+          </w:p>
+        </w:tc>
+        <w:tc>
+          <w:tcPr>
+            <w:tcW w:type="dxa" w:w="1881"/>
+          </w:tcPr>
+          <w:p>
+            <w:pPr>
+              <w:jc w:val="center"/>
+            </w:pPr>
+            <w:r>
+              <w:t>0.171833</w:t>
+            </w:r>
+          </w:p>
+        </w:tc>
+        <w:tc>
+          <w:tcPr>
+            <w:tcW w:type="dxa" w:w="1881"/>
+          </w:tcPr>
+          <w:p>
+            <w:pPr>
+              <w:jc w:val="center"/>
+            </w:pPr>
+            <w:r>
+              <w:t>개선</w:t>
+            </w:r>
+          </w:p>
+        </w:tc>
+        <w:tc>
+          <w:tcPr>
+            <w:tcW w:type="dxa" w:w="1881"/>
+          </w:tcPr>
+          <w:p>
+            <w:pPr>
+              <w:jc w:val="center"/>
+            </w:pPr>
+            <w:r/>
+          </w:p>
+        </w:tc>
+      </w:tr>
+      <w:tr>
+        <w:tc>
+          <w:tcPr>
+            <w:tcW w:type="dxa" w:w="1881"/>
+          </w:tcPr>
+          <w:p>
+            <w:pPr>
+              <w:jc w:val="center"/>
+            </w:pPr>
+            <w:r>
+              <w:t>3</w:t>
+            </w:r>
+          </w:p>
+        </w:tc>
+        <w:tc>
+          <w:tcPr>
+            <w:tcW w:type="dxa" w:w="1881"/>
+          </w:tcPr>
+          <w:p>
+            <w:pPr>
+              <w:jc w:val="center"/>
+            </w:pPr>
+            <w:r>
+              <w:t>0.003706</w:t>
+            </w:r>
+          </w:p>
+        </w:tc>
+        <w:tc>
+          <w:tcPr>
+            <w:tcW w:type="dxa" w:w="1881"/>
+          </w:tcPr>
+          <w:p>
+            <w:pPr>
+              <w:jc w:val="center"/>
+            </w:pPr>
+            <w:r>
+              <w:t>0.179786</w:t>
+            </w:r>
+          </w:p>
+        </w:tc>
+        <w:tc>
+          <w:tcPr>
+            <w:tcW w:type="dxa" w:w="1881"/>
+          </w:tcPr>
+          <w:p>
+            <w:pPr>
+              <w:jc w:val="center"/>
+            </w:pPr>
+            <w:r>
+              <w:t>미개선</w:t>
+            </w:r>
+          </w:p>
+        </w:tc>
+        <w:tc>
+          <w:tcPr>
+            <w:tcW w:type="dxa" w:w="1881"/>
+          </w:tcPr>
+          <w:p>
+            <w:pPr>
+              <w:jc w:val="center"/>
+            </w:pPr>
+            <w:r/>
+          </w:p>
+        </w:tc>
+      </w:tr>
+      <w:tr>
+        <w:tc>
+          <w:tcPr>
+            <w:tcW w:type="dxa" w:w="1881"/>
+          </w:tcPr>
+          <w:p>
+            <w:pPr>
+              <w:jc w:val="center"/>
+            </w:pPr>
+            <w:r>
+              <w:t>4</w:t>
+            </w:r>
+          </w:p>
+        </w:tc>
+        <w:tc>
+          <w:tcPr>
+            <w:tcW w:type="dxa" w:w="1881"/>
+          </w:tcPr>
+          <w:p>
+            <w:pPr>
+              <w:jc w:val="center"/>
+            </w:pPr>
+            <w:r>
+              <w:t>0.002713</w:t>
+            </w:r>
+          </w:p>
+        </w:tc>
+        <w:tc>
+          <w:tcPr>
+            <w:tcW w:type="dxa" w:w="1881"/>
+          </w:tcPr>
+          <w:p>
+            <w:pPr>
+              <w:jc w:val="center"/>
+            </w:pPr>
+            <w:r>
+              <w:t>0.146897</w:t>
+            </w:r>
+          </w:p>
+        </w:tc>
+        <w:tc>
+          <w:tcPr>
+            <w:tcW w:type="dxa" w:w="1881"/>
+          </w:tcPr>
+          <w:p>
+            <w:pPr>
+              <w:jc w:val="center"/>
+            </w:pPr>
+            <w:r>
+              <w:t>개선</w:t>
+            </w:r>
+          </w:p>
+        </w:tc>
+        <w:tc>
+          <w:tcPr>
+            <w:tcW w:type="dxa" w:w="1881"/>
+          </w:tcPr>
+          <w:p>
+            <w:pPr>
+              <w:jc w:val="center"/>
+            </w:pPr>
+            <w:r/>
+          </w:p>
+        </w:tc>
+      </w:tr>
+      <w:tr>
+        <w:tc>
+          <w:tcPr>
+            <w:tcW w:type="dxa" w:w="1881"/>
+            <w:shd w:val="clear" w:color="auto" w:fill="E2EFDA"/>
+          </w:tcPr>
+          <w:p>
+            <w:pPr>
+              <w:jc w:val="center"/>
+            </w:pPr>
+            <w:r>
+              <w:rPr>
+                <w:b/>
+              </w:rPr>
+              <w:t>5</w:t>
+            </w:r>
+          </w:p>
+        </w:tc>
+        <w:tc>
+          <w:tcPr>
+            <w:tcW w:type="dxa" w:w="1881"/>
+            <w:shd w:val="clear" w:color="auto" w:fill="E2EFDA"/>
+          </w:tcPr>
+          <w:p>
+            <w:pPr>
+              <w:jc w:val="center"/>
+            </w:pPr>
+            <w:r>
+              <w:rPr>
+                <w:b/>
+              </w:rPr>
+              <w:t>0.002102</w:t>
+            </w:r>
+          </w:p>
+        </w:tc>
+        <w:tc>
+          <w:tcPr>
+            <w:tcW w:type="dxa" w:w="1881"/>
+            <w:shd w:val="clear" w:color="auto" w:fill="E2EFDA"/>
+          </w:tcPr>
+          <w:p>
+            <w:pPr>
+              <w:jc w:val="center"/>
+            </w:pPr>
+            <w:r>
+              <w:rPr>
+                <w:b/>
+              </w:rPr>
+              <w:t>0.144659</w:t>
+            </w:r>
+          </w:p>
+        </w:tc>
+        <w:tc>
+          <w:tcPr>
+            <w:tcW w:type="dxa" w:w="1881"/>
+            <w:shd w:val="clear" w:color="auto" w:fill="E2EFDA"/>
+          </w:tcPr>
+          <w:p>
+            <w:pPr>
+              <w:jc w:val="center"/>
+            </w:pPr>
+            <w:r>
+              <w:rPr>
+                <w:b/>
+              </w:rPr>
+              <w:t>최솟값 (Best)</w:t>
+            </w:r>
+          </w:p>
+        </w:tc>
+        <w:tc>
+          <w:tcPr>
+            <w:tcW w:type="dxa" w:w="1881"/>
+            <w:shd w:val="clear" w:color="auto" w:fill="E2EFDA"/>
+          </w:tcPr>
+          <w:p>
+            <w:pPr>
+              <w:jc w:val="center"/>
+            </w:pPr>
+            <w:r>
+              <w:rPr>
+                <w:b/>
+              </w:rPr>
+              <w:t>★ 가중치 복원 기준</w:t>
+            </w:r>
+          </w:p>
+        </w:tc>
+      </w:tr>
+      <w:tr>
+        <w:tc>
+          <w:tcPr>
+            <w:tcW w:type="dxa" w:w="1881"/>
+          </w:tcPr>
+          <w:p>
+            <w:pPr>
+              <w:jc w:val="center"/>
+            </w:pPr>
+            <w:r>
+              <w:t>6</w:t>
+            </w:r>
+          </w:p>
+        </w:tc>
+        <w:tc>
+          <w:tcPr>
+            <w:tcW w:type="dxa" w:w="1881"/>
+          </w:tcPr>
+          <w:p>
+            <w:pPr>
+              <w:jc w:val="center"/>
+            </w:pPr>
+            <w:r>
+              <w:t>0.002309</w:t>
+            </w:r>
+          </w:p>
+        </w:tc>
+        <w:tc>
+          <w:tcPr>
+            <w:tcW w:type="dxa" w:w="1881"/>
+          </w:tcPr>
+          <w:p>
+            <w:pPr>
+              <w:jc w:val="center"/>
+            </w:pPr>
+            <w:r>
+              <w:t>0.144960</w:t>
+            </w:r>
+          </w:p>
+        </w:tc>
+        <w:tc>
+          <w:tcPr>
+            <w:tcW w:type="dxa" w:w="1881"/>
+          </w:tcPr>
+          <w:p>
+            <w:pPr>
+              <w:jc w:val="center"/>
+            </w:pPr>
+            <w:r>
+              <w:t>미개선</w:t>
+            </w:r>
+          </w:p>
+        </w:tc>
+        <w:tc>
+          <w:tcPr>
+            <w:tcW w:type="dxa" w:w="1881"/>
+          </w:tcPr>
+          <w:p>
+            <w:pPr>
+              <w:jc w:val="center"/>
+            </w:pPr>
+            <w:r/>
+          </w:p>
+        </w:tc>
+      </w:tr>
+      <w:tr>
+        <w:tc>
+          <w:tcPr>
+            <w:tcW w:type="dxa" w:w="1881"/>
+          </w:tcPr>
+          <w:p>
+            <w:pPr>
+              <w:jc w:val="center"/>
+            </w:pPr>
+            <w:r>
+              <w:t>7</w:t>
+            </w:r>
+          </w:p>
+        </w:tc>
+        <w:tc>
+          <w:tcPr>
+            <w:tcW w:type="dxa" w:w="1881"/>
+          </w:tcPr>
+          <w:p>
+            <w:pPr>
+              <w:jc w:val="center"/>
+            </w:pPr>
+            <w:r>
+              <w:t>0.001923</w:t>
+            </w:r>
+          </w:p>
+        </w:tc>
+        <w:tc>
+          <w:tcPr>
+            <w:tcW w:type="dxa" w:w="1881"/>
+          </w:tcPr>
+          <w:p>
+            <w:pPr>
+              <w:jc w:val="center"/>
+            </w:pPr>
+            <w:r>
+              <w:t>0.158871</w:t>
+            </w:r>
+          </w:p>
+        </w:tc>
+        <w:tc>
+          <w:tcPr>
+            <w:tcW w:type="dxa" w:w="1881"/>
+          </w:tcPr>
+          <w:p>
+            <w:pPr>
+              <w:jc w:val="center"/>
+            </w:pPr>
+            <w:r>
+              <w:t>미개선</w:t>
+            </w:r>
+          </w:p>
+        </w:tc>
+        <w:tc>
+          <w:tcPr>
+            <w:tcW w:type="dxa" w:w="1881"/>
+          </w:tcPr>
+          <w:p>
+            <w:pPr>
+              <w:jc w:val="center"/>
+            </w:pPr>
+            <w:r/>
+          </w:p>
+        </w:tc>
+      </w:tr>
+      <w:tr>
+        <w:tc>
+          <w:tcPr>
+            <w:tcW w:type="dxa" w:w="1881"/>
+          </w:tcPr>
+          <w:p>
+            <w:pPr>
+              <w:jc w:val="center"/>
+            </w:pPr>
+            <w:r>
+              <w:t>8</w:t>
+            </w:r>
+          </w:p>
+        </w:tc>
+        <w:tc>
+          <w:tcPr>
+            <w:tcW w:type="dxa" w:w="1881"/>
+          </w:tcPr>
+          <w:p>
+            <w:pPr>
+              <w:jc w:val="center"/>
+            </w:pPr>
+            <w:r>
+              <w:t>0.001933</w:t>
+            </w:r>
+          </w:p>
+        </w:tc>
+        <w:tc>
+          <w:tcPr>
+            <w:tcW w:type="dxa" w:w="1881"/>
+          </w:tcPr>
+          <w:p>
+            <w:pPr>
+              <w:jc w:val="center"/>
+            </w:pPr>
+            <w:r>
+              <w:t>0.148637</w:t>
+            </w:r>
+          </w:p>
+        </w:tc>
+        <w:tc>
+          <w:tcPr>
+            <w:tcW w:type="dxa" w:w="1881"/>
+          </w:tcPr>
+          <w:p>
+            <w:pPr>
+              <w:jc w:val="center"/>
+            </w:pPr>
+            <w:r>
+              <w:t>개선</w:t>
+            </w:r>
+          </w:p>
+        </w:tc>
+        <w:tc>
+          <w:tcPr>
+            <w:tcW w:type="dxa" w:w="1881"/>
+          </w:tcPr>
+          <w:p>
+            <w:pPr>
+              <w:jc w:val="center"/>
+            </w:pPr>
+            <w:r/>
+          </w:p>
+        </w:tc>
+      </w:tr>
+      <w:tr>
+        <w:tc>
+          <w:tcPr>
+            <w:tcW w:type="dxa" w:w="1881"/>
+          </w:tcPr>
+          <w:p>
+            <w:pPr>
+              <w:jc w:val="center"/>
+            </w:pPr>
+            <w:r>
+              <w:t>9</w:t>
+            </w:r>
+          </w:p>
+        </w:tc>
+        <w:tc>
+          <w:tcPr>
+            <w:tcW w:type="dxa" w:w="1881"/>
+          </w:tcPr>
+          <w:p>
+            <w:pPr>
+              <w:jc w:val="center"/>
+            </w:pPr>
+            <w:r>
+              <w:t>0.001931</w:t>
+            </w:r>
+          </w:p>
+        </w:tc>
+        <w:tc>
+          <w:tcPr>
+            <w:tcW w:type="dxa" w:w="1881"/>
+          </w:tcPr>
+          <w:p>
+            <w:pPr>
+              <w:jc w:val="center"/>
+            </w:pPr>
+            <w:r>
+              <w:t>0.186325</w:t>
+            </w:r>
+          </w:p>
+        </w:tc>
+        <w:tc>
+          <w:tcPr>
+            <w:tcW w:type="dxa" w:w="1881"/>
+          </w:tcPr>
+          <w:p>
+            <w:pPr>
+              <w:jc w:val="center"/>
+            </w:pPr>
+            <w:r>
+              <w:t>미개선</w:t>
+            </w:r>
+          </w:p>
+        </w:tc>
+        <w:tc>
+          <w:tcPr>
+            <w:tcW w:type="dxa" w:w="1881"/>
+          </w:tcPr>
+          <w:p>
+            <w:pPr>
+              <w:jc w:val="center"/>
+            </w:pPr>
+            <w:r/>
+          </w:p>
+        </w:tc>
+      </w:tr>
+      <w:tr>
+        <w:tc>
+          <w:tcPr>
+            <w:tcW w:type="dxa" w:w="1881"/>
+            <w:shd w:val="clear" w:color="auto" w:fill="FFF2CC"/>
+          </w:tcPr>
+          <w:p>
+            <w:pPr>
+              <w:jc w:val="center"/>
+            </w:pPr>
+            <w:r>
+              <w:t>10</w:t>
+            </w:r>
+          </w:p>
+        </w:tc>
+        <w:tc>
+          <w:tcPr>
+            <w:tcW w:type="dxa" w:w="1881"/>
+            <w:shd w:val="clear" w:color="auto" w:fill="FFF2CC"/>
+          </w:tcPr>
+          <w:p>
+            <w:pPr>
+              <w:jc w:val="center"/>
+            </w:pPr>
+            <w:r>
+              <w:t>0.002167</w:t>
+            </w:r>
+          </w:p>
+        </w:tc>
+        <w:tc>
+          <w:tcPr>
+            <w:tcW w:type="dxa" w:w="1881"/>
+            <w:shd w:val="clear" w:color="auto" w:fill="FFF2CC"/>
+          </w:tcPr>
+          <w:p>
+            <w:pPr>
+              <w:jc w:val="center"/>
+            </w:pPr>
+            <w:r>
+              <w:t>0.161805</w:t>
+            </w:r>
+          </w:p>
+        </w:tc>
+        <w:tc>
+          <w:tcPr>
+            <w:tcW w:type="dxa" w:w="1881"/>
+            <w:shd w:val="clear" w:color="auto" w:fill="FFF2CC"/>
+          </w:tcPr>
+          <w:p>
+            <w:pPr>
+              <w:jc w:val="center"/>
+            </w:pPr>
+            <w:r>
+              <w:t>개선</w:t>
+            </w:r>
+          </w:p>
+        </w:tc>
+        <w:tc>
+          <w:tcPr>
+            <w:tcW w:type="dxa" w:w="1881"/>
+            <w:shd w:val="clear" w:color="auto" w:fill="FFF2CC"/>
+          </w:tcPr>
+          <w:p>
+            <w:pPr>
+              <w:jc w:val="center"/>
+            </w:pPr>
+            <w:r>
+              <w:t>EarlyStopping 종료</w:t>
+            </w:r>
+          </w:p>
+        </w:tc>
+      </w:tr>
+    </w:tbl>
+    <w:p>
+      <w:r>
+        <w:t>Train Loss는 epoch 내내 단조 감소하지만 Val Loss는 epoch 5에서 최솟값 후 반등.</w:t>
+        <w:br/>
+        <w:t>이 지점이 과소적합(좌)과 과적합(우)의 경계이며 EarlyStopping이 이를 자동 포착합니다.</w:t>
+      </w:r>
+    </w:p>
+    <w:p>
+      <w:pPr>
+        <w:pStyle w:val="Heading2"/>
+      </w:pPr>
+      <w:r>
+        <w:t>8.3 GRU Grid Search 27 조합 - 하이퍼파라미터 탐색 비교</w:t>
+      </w:r>
+    </w:p>
+    <w:p>
+      <w:r>
+        <w:t>5종 비교/튜닝 실험에서는 조합별 최종 OOS RMSE를 저장하였습니다. 아래는 27 조합 중 Best 5 / Worst 3 비교로 하이퍼파라미터 영향도를 나타냅니다.</w:t>
+      </w:r>
+    </w:p>
+    <w:tbl>
+      <w:tblPr>
+        <w:tblStyle w:val="TableGrid"/>
+        <w:tblW w:type="auto" w:w="0"/>
+        <w:tblLook w:firstColumn="1" w:firstRow="1" w:lastColumn="0" w:lastRow="0" w:noHBand="0" w:noVBand="1" w:val="04A0"/>
+      </w:tblPr>
+      <w:tblGrid>
+        <w:gridCol w:w="1568"/>
+        <w:gridCol w:w="1568"/>
+        <w:gridCol w:w="1568"/>
+        <w:gridCol w:w="1568"/>
+        <w:gridCol w:w="1568"/>
+        <w:gridCol w:w="1568"/>
+      </w:tblGrid>
+      <w:tr>
+        <w:tc>
+          <w:tcPr>
+            <w:tcW w:type="dxa" w:w="1568"/>
+            <w:shd w:val="clear" w:color="auto" w:fill="4472C4"/>
+          </w:tcPr>
+          <w:p>
+            <w:pPr>
+              <w:jc w:val="center"/>
+            </w:pPr>
+            <w:r>
+              <w:rPr>
+                <w:b/>
+                <w:color w:val="FFFFFF"/>
+              </w:rPr>
+              <w:t>순위</w:t>
+            </w:r>
+          </w:p>
+        </w:tc>
+        <w:tc>
+          <w:tcPr>
+            <w:tcW w:type="dxa" w:w="1568"/>
+            <w:shd w:val="clear" w:color="auto" w:fill="4472C4"/>
+          </w:tcPr>
+          <w:p>
+            <w:pPr>
+              <w:jc w:val="center"/>
+            </w:pPr>
+            <w:r>
+              <w:rPr>
+                <w:b/>
+                <w:color w:val="FFFFFF"/>
+              </w:rPr>
+              <w:t>window</w:t>
+            </w:r>
+          </w:p>
+        </w:tc>
+        <w:tc>
+          <w:tcPr>
+            <w:tcW w:type="dxa" w:w="1568"/>
+            <w:shd w:val="clear" w:color="auto" w:fill="4472C4"/>
+          </w:tcPr>
+          <w:p>
+            <w:pPr>
+              <w:jc w:val="center"/>
+            </w:pPr>
+            <w:r>
+              <w:rPr>
+                <w:b/>
+                <w:color w:val="FFFFFF"/>
+              </w:rPr>
+              <w:t>units</w:t>
+            </w:r>
+          </w:p>
+        </w:tc>
+        <w:tc>
+          <w:tcPr>
+            <w:tcW w:type="dxa" w:w="1568"/>
+            <w:shd w:val="clear" w:color="auto" w:fill="4472C4"/>
+          </w:tcPr>
+          <w:p>
+            <w:pPr>
+              <w:jc w:val="center"/>
+            </w:pPr>
+            <w:r>
+              <w:rPr>
+                <w:b/>
+                <w:color w:val="FFFFFF"/>
+              </w:rPr>
+              <w:t>dropout</w:t>
+            </w:r>
+          </w:p>
+        </w:tc>
+        <w:tc>
+          <w:tcPr>
+            <w:tcW w:type="dxa" w:w="1568"/>
+            <w:shd w:val="clear" w:color="auto" w:fill="4472C4"/>
+          </w:tcPr>
+          <w:p>
+            <w:pPr>
+              <w:jc w:val="center"/>
+            </w:pPr>
+            <w:r>
+              <w:rPr>
+                <w:b/>
+                <w:color w:val="FFFFFF"/>
+              </w:rPr>
+              <w:t>CV RMSE</w:t>
+            </w:r>
+          </w:p>
+        </w:tc>
+        <w:tc>
+          <w:tcPr>
+            <w:tcW w:type="dxa" w:w="1568"/>
+            <w:shd w:val="clear" w:color="auto" w:fill="4472C4"/>
+          </w:tcPr>
+          <w:p>
+            <w:pPr>
+              <w:jc w:val="center"/>
+            </w:pPr>
+            <w:r>
+              <w:rPr>
+                <w:b/>
+                <w:color w:val="FFFFFF"/>
+              </w:rPr>
+              <w:t>OOS RMSE</w:t>
+            </w:r>
+          </w:p>
+        </w:tc>
+      </w:tr>
+      <w:tr>
+        <w:tc>
+          <w:tcPr>
+            <w:tcW w:type="dxa" w:w="1568"/>
+            <w:shd w:val="clear" w:color="auto" w:fill="E2EFDA"/>
+          </w:tcPr>
+          <w:p>
+            <w:pPr>
+              <w:jc w:val="center"/>
+            </w:pPr>
+            <w:r>
+              <w:rPr>
+                <w:b/>
+              </w:rPr>
+              <w:t>Best 1 (최적) ★</w:t>
+            </w:r>
+          </w:p>
+        </w:tc>
+        <w:tc>
+          <w:tcPr>
+            <w:tcW w:type="dxa" w:w="1568"/>
+            <w:shd w:val="clear" w:color="auto" w:fill="E2EFDA"/>
+          </w:tcPr>
+          <w:p>
+            <w:pPr>
+              <w:jc w:val="center"/>
+            </w:pPr>
+            <w:r>
+              <w:rPr>
+                <w:b/>
+              </w:rPr>
+              <w:t>20</w:t>
+            </w:r>
+          </w:p>
+        </w:tc>
+        <w:tc>
+          <w:tcPr>
+            <w:tcW w:type="dxa" w:w="1568"/>
+            <w:shd w:val="clear" w:color="auto" w:fill="E2EFDA"/>
+          </w:tcPr>
+          <w:p>
+            <w:pPr>
+              <w:jc w:val="center"/>
+            </w:pPr>
+            <w:r>
+              <w:rPr>
+                <w:b/>
+              </w:rPr>
+              <w:t>32</w:t>
+            </w:r>
+          </w:p>
+        </w:tc>
+        <w:tc>
+          <w:tcPr>
+            <w:tcW w:type="dxa" w:w="1568"/>
+            <w:shd w:val="clear" w:color="auto" w:fill="E2EFDA"/>
+          </w:tcPr>
+          <w:p>
+            <w:pPr>
+              <w:jc w:val="center"/>
+            </w:pPr>
+            <w:r>
+              <w:rPr>
+                <w:b/>
+              </w:rPr>
+              <w:t>0.1</w:t>
+            </w:r>
+          </w:p>
+        </w:tc>
+        <w:tc>
+          <w:tcPr>
+            <w:tcW w:type="dxa" w:w="1568"/>
+            <w:shd w:val="clear" w:color="auto" w:fill="E2EFDA"/>
+          </w:tcPr>
+          <w:p>
+            <w:pPr>
+              <w:jc w:val="center"/>
+            </w:pPr>
+            <w:r>
+              <w:rPr>
+                <w:b/>
+              </w:rPr>
+              <w:t>1,184.99</w:t>
+            </w:r>
+          </w:p>
+        </w:tc>
+        <w:tc>
+          <w:tcPr>
+            <w:tcW w:type="dxa" w:w="1568"/>
+            <w:shd w:val="clear" w:color="auto" w:fill="E2EFDA"/>
+          </w:tcPr>
+          <w:p>
+            <w:pPr>
+              <w:jc w:val="center"/>
+            </w:pPr>
+            <w:r>
+              <w:rPr>
+                <w:b/>
+              </w:rPr>
+              <w:t>956.05</w:t>
+            </w:r>
+          </w:p>
+        </w:tc>
+      </w:tr>
+      <w:tr>
+        <w:tc>
+          <w:tcPr>
+            <w:tcW w:type="dxa" w:w="1568"/>
+          </w:tcPr>
+          <w:p>
+            <w:pPr>
+              <w:jc w:val="center"/>
+            </w:pPr>
+            <w:r>
+              <w:t>Best 2</w:t>
+            </w:r>
+          </w:p>
+        </w:tc>
+        <w:tc>
+          <w:tcPr>
+            <w:tcW w:type="dxa" w:w="1568"/>
+          </w:tcPr>
+          <w:p>
+            <w:pPr>
+              <w:jc w:val="center"/>
+            </w:pPr>
+            <w:r>
+              <w:t>20</w:t>
+            </w:r>
+          </w:p>
+        </w:tc>
+        <w:tc>
+          <w:tcPr>
+            <w:tcW w:type="dxa" w:w="1568"/>
+          </w:tcPr>
+          <w:p>
+            <w:pPr>
+              <w:jc w:val="center"/>
+            </w:pPr>
+            <w:r>
+              <w:t>64</w:t>
+            </w:r>
+          </w:p>
+        </w:tc>
+        <w:tc>
+          <w:tcPr>
+            <w:tcW w:type="dxa" w:w="1568"/>
+          </w:tcPr>
+          <w:p>
+            <w:pPr>
+              <w:jc w:val="center"/>
+            </w:pPr>
+            <w:r>
+              <w:t>0.1</w:t>
+            </w:r>
+          </w:p>
+        </w:tc>
+        <w:tc>
+          <w:tcPr>
+            <w:tcW w:type="dxa" w:w="1568"/>
+          </w:tcPr>
+          <w:p>
+            <w:pPr>
+              <w:jc w:val="center"/>
+            </w:pPr>
+            <w:r>
+              <w:t>1,169.16</w:t>
+            </w:r>
+          </w:p>
+        </w:tc>
+        <w:tc>
+          <w:tcPr>
+            <w:tcW w:type="dxa" w:w="1568"/>
+          </w:tcPr>
+          <w:p>
+            <w:pPr>
+              <w:jc w:val="center"/>
+            </w:pPr>
+            <w:r>
+              <w:t>959.55</w:t>
+            </w:r>
+          </w:p>
+        </w:tc>
+      </w:tr>
+      <w:tr>
+        <w:tc>
+          <w:tcPr>
+            <w:tcW w:type="dxa" w:w="1568"/>
+          </w:tcPr>
+          <w:p>
+            <w:pPr>
+              <w:jc w:val="center"/>
+            </w:pPr>
+            <w:r>
+              <w:t>Best 3</w:t>
+            </w:r>
+          </w:p>
+        </w:tc>
+        <w:tc>
+          <w:tcPr>
+            <w:tcW w:type="dxa" w:w="1568"/>
+          </w:tcPr>
+          <w:p>
+            <w:pPr>
+              <w:jc w:val="center"/>
+            </w:pPr>
+            <w:r>
+              <w:t>30</w:t>
+            </w:r>
+          </w:p>
+        </w:tc>
+        <w:tc>
+          <w:tcPr>
+            <w:tcW w:type="dxa" w:w="1568"/>
+          </w:tcPr>
+          <w:p>
+            <w:pPr>
+              <w:jc w:val="center"/>
+            </w:pPr>
+            <w:r>
+              <w:t>128</w:t>
+            </w:r>
+          </w:p>
+        </w:tc>
+        <w:tc>
+          <w:tcPr>
+            <w:tcW w:type="dxa" w:w="1568"/>
+          </w:tcPr>
+          <w:p>
+            <w:pPr>
+              <w:jc w:val="center"/>
+            </w:pPr>
+            <w:r>
+              <w:t>0.1</w:t>
+            </w:r>
+          </w:p>
+        </w:tc>
+        <w:tc>
+          <w:tcPr>
+            <w:tcW w:type="dxa" w:w="1568"/>
+          </w:tcPr>
+          <w:p>
+            <w:pPr>
+              <w:jc w:val="center"/>
+            </w:pPr>
+            <w:r>
+              <w:t>1,144.85</w:t>
+            </w:r>
+          </w:p>
+        </w:tc>
+        <w:tc>
+          <w:tcPr>
+            <w:tcW w:type="dxa" w:w="1568"/>
+          </w:tcPr>
+          <w:p>
+            <w:pPr>
+              <w:jc w:val="center"/>
+            </w:pPr>
+            <w:r>
+              <w:t>968.52</w:t>
+            </w:r>
+          </w:p>
+        </w:tc>
+      </w:tr>
+      <w:tr>
+        <w:tc>
+          <w:tcPr>
+            <w:tcW w:type="dxa" w:w="1568"/>
+          </w:tcPr>
+          <w:p>
+            <w:pPr>
+              <w:jc w:val="center"/>
+            </w:pPr>
+            <w:r>
+              <w:t>Best 4</w:t>
+            </w:r>
+          </w:p>
+        </w:tc>
+        <w:tc>
+          <w:tcPr>
+            <w:tcW w:type="dxa" w:w="1568"/>
+          </w:tcPr>
+          <w:p>
+            <w:pPr>
+              <w:jc w:val="center"/>
+            </w:pPr>
+            <w:r>
+              <w:t>20</w:t>
+            </w:r>
+          </w:p>
+        </w:tc>
+        <w:tc>
+          <w:tcPr>
+            <w:tcW w:type="dxa" w:w="1568"/>
+          </w:tcPr>
+          <w:p>
+            <w:pPr>
+              <w:jc w:val="center"/>
+            </w:pPr>
+            <w:r>
+              <w:t>64</w:t>
+            </w:r>
+          </w:p>
+        </w:tc>
+        <w:tc>
+          <w:tcPr>
+            <w:tcW w:type="dxa" w:w="1568"/>
+          </w:tcPr>
+          <w:p>
+            <w:pPr>
+              <w:jc w:val="center"/>
+            </w:pPr>
+            <w:r>
+              <w:t>0.2</w:t>
+            </w:r>
+          </w:p>
+        </w:tc>
+        <w:tc>
+          <w:tcPr>
+            <w:tcW w:type="dxa" w:w="1568"/>
+          </w:tcPr>
+          <w:p>
+            <w:pPr>
+              <w:jc w:val="center"/>
+            </w:pPr>
+            <w:r>
+              <w:t>1,158.35</w:t>
+            </w:r>
+          </w:p>
+        </w:tc>
+        <w:tc>
+          <w:tcPr>
+            <w:tcW w:type="dxa" w:w="1568"/>
+          </w:tcPr>
+          <w:p>
+            <w:pPr>
+              <w:jc w:val="center"/>
+            </w:pPr>
+            <w:r>
+              <w:t>971.71</w:t>
+            </w:r>
+          </w:p>
+        </w:tc>
+      </w:tr>
+      <w:tr>
+        <w:tc>
+          <w:tcPr>
+            <w:tcW w:type="dxa" w:w="1568"/>
+          </w:tcPr>
+          <w:p>
+            <w:pPr>
+              <w:jc w:val="center"/>
+            </w:pPr>
+            <w:r>
+              <w:t>Best 5</w:t>
+            </w:r>
+          </w:p>
+        </w:tc>
+        <w:tc>
+          <w:tcPr>
+            <w:tcW w:type="dxa" w:w="1568"/>
+          </w:tcPr>
+          <w:p>
+            <w:pPr>
+              <w:jc w:val="center"/>
+            </w:pPr>
+            <w:r>
+              <w:t>30</w:t>
+            </w:r>
+          </w:p>
+        </w:tc>
+        <w:tc>
+          <w:tcPr>
+            <w:tcW w:type="dxa" w:w="1568"/>
+          </w:tcPr>
+          <w:p>
+            <w:pPr>
+              <w:jc w:val="center"/>
+            </w:pPr>
+            <w:r>
+              <w:t>64</w:t>
+            </w:r>
+          </w:p>
+        </w:tc>
+        <w:tc>
+          <w:tcPr>
+            <w:tcW w:type="dxa" w:w="1568"/>
+          </w:tcPr>
+          <w:p>
+            <w:pPr>
+              <w:jc w:val="center"/>
+            </w:pPr>
+            <w:r>
+              <w:t>0.1</w:t>
+            </w:r>
+          </w:p>
+        </w:tc>
+        <w:tc>
+          <w:tcPr>
+            <w:tcW w:type="dxa" w:w="1568"/>
+          </w:tcPr>
+          <w:p>
+            <w:pPr>
+              <w:jc w:val="center"/>
+            </w:pPr>
+            <w:r>
+              <w:t>1,255.48</w:t>
+            </w:r>
+          </w:p>
+        </w:tc>
+        <w:tc>
+          <w:tcPr>
+            <w:tcW w:type="dxa" w:w="1568"/>
+          </w:tcPr>
+          <w:p>
+            <w:pPr>
+              <w:jc w:val="center"/>
+            </w:pPr>
+            <w:r>
+              <w:t>978.35</w:t>
+            </w:r>
+          </w:p>
+        </w:tc>
+      </w:tr>
+      <w:tr>
+        <w:tc>
+          <w:tcPr>
+            <w:tcW w:type="dxa" w:w="1568"/>
+            <w:shd w:val="clear" w:color="auto" w:fill="D9D9D9"/>
+          </w:tcPr>
+          <w:p>
+            <w:r>
+              <w:t>... (중간 생략) ...</w:t>
+            </w:r>
+          </w:p>
+        </w:tc>
+        <w:tc>
+          <w:tcPr>
+            <w:tcW w:type="dxa" w:w="1568"/>
+            <w:shd w:val="clear" w:color="auto" w:fill="D9D9D9"/>
+          </w:tcPr>
+          <w:p>
+            <w:r>
+              <w:t>... (중간 생략) ...</w:t>
+            </w:r>
+          </w:p>
+        </w:tc>
+        <w:tc>
+          <w:tcPr>
+            <w:tcW w:type="dxa" w:w="1568"/>
+            <w:shd w:val="clear" w:color="auto" w:fill="D9D9D9"/>
+          </w:tcPr>
+          <w:p>
+            <w:r>
+              <w:t>... (중간 생략) ...</w:t>
+            </w:r>
+          </w:p>
+        </w:tc>
+        <w:tc>
+          <w:tcPr>
+            <w:tcW w:type="dxa" w:w="1568"/>
+            <w:shd w:val="clear" w:color="auto" w:fill="D9D9D9"/>
+          </w:tcPr>
+          <w:p>
+            <w:r>
+              <w:t>... (중간 생략) ...</w:t>
+            </w:r>
+          </w:p>
+        </w:tc>
+        <w:tc>
+          <w:tcPr>
+            <w:tcW w:type="dxa" w:w="1568"/>
+            <w:shd w:val="clear" w:color="auto" w:fill="D9D9D9"/>
+          </w:tcPr>
+          <w:p>
+            <w:r>
+              <w:t>... (중간 생략) ...</w:t>
+            </w:r>
+          </w:p>
+        </w:tc>
+        <w:tc>
+          <w:tcPr>
+            <w:tcW w:type="dxa" w:w="1568"/>
+            <w:shd w:val="clear" w:color="auto" w:fill="D9D9D9"/>
+          </w:tcPr>
+          <w:p>
+            <w:r>
+              <w:t>... (중간 생략) ...</w:t>
+            </w:r>
+          </w:p>
+        </w:tc>
+      </w:tr>
+      <w:tr>
+        <w:tc>
+          <w:tcPr>
+            <w:tcW w:type="dxa" w:w="1568"/>
+            <w:shd w:val="clear" w:color="auto" w:fill="FCE4D6"/>
+          </w:tcPr>
+          <w:p>
+            <w:pPr>
+              <w:jc w:val="center"/>
+            </w:pPr>
+            <w:r>
+              <w:t>Worst 1</w:t>
+            </w:r>
+          </w:p>
+        </w:tc>
+        <w:tc>
+          <w:tcPr>
+            <w:tcW w:type="dxa" w:w="1568"/>
+            <w:shd w:val="clear" w:color="auto" w:fill="FCE4D6"/>
+          </w:tcPr>
+          <w:p>
+            <w:pPr>
+              <w:jc w:val="center"/>
+            </w:pPr>
+            <w:r>
+              <w:t>50</w:t>
+            </w:r>
+          </w:p>
+        </w:tc>
+        <w:tc>
+          <w:tcPr>
+            <w:tcW w:type="dxa" w:w="1568"/>
+            <w:shd w:val="clear" w:color="auto" w:fill="FCE4D6"/>
+          </w:tcPr>
+          <w:p>
+            <w:pPr>
+              <w:jc w:val="center"/>
+            </w:pPr>
+            <w:r>
+              <w:t>32</w:t>
+            </w:r>
+          </w:p>
+        </w:tc>
+        <w:tc>
+          <w:tcPr>
+            <w:tcW w:type="dxa" w:w="1568"/>
+            <w:shd w:val="clear" w:color="auto" w:fill="FCE4D6"/>
+          </w:tcPr>
+          <w:p>
+            <w:pPr>
+              <w:jc w:val="center"/>
+            </w:pPr>
+            <w:r>
+              <w:t>0.3</w:t>
+            </w:r>
+          </w:p>
+        </w:tc>
+        <w:tc>
+          <w:tcPr>
+            <w:tcW w:type="dxa" w:w="1568"/>
+            <w:shd w:val="clear" w:color="auto" w:fill="FCE4D6"/>
+          </w:tcPr>
+          <w:p>
+            <w:pPr>
+              <w:jc w:val="center"/>
+            </w:pPr>
+            <w:r>
+              <w:t>1,170.94</w:t>
+            </w:r>
+          </w:p>
+        </w:tc>
+        <w:tc>
+          <w:tcPr>
+            <w:tcW w:type="dxa" w:w="1568"/>
+            <w:shd w:val="clear" w:color="auto" w:fill="FCE4D6"/>
+          </w:tcPr>
+          <w:p>
+            <w:pPr>
+              <w:jc w:val="center"/>
+            </w:pPr>
+            <w:r>
+              <w:t>1,155.10</w:t>
+            </w:r>
+          </w:p>
+        </w:tc>
+      </w:tr>
+      <w:tr>
+        <w:tc>
+          <w:tcPr>
+            <w:tcW w:type="dxa" w:w="1568"/>
+            <w:shd w:val="clear" w:color="auto" w:fill="FCE4D6"/>
+          </w:tcPr>
+          <w:p>
+            <w:pPr>
+              <w:jc w:val="center"/>
+            </w:pPr>
+            <w:r>
+              <w:t>Worst 2</w:t>
+            </w:r>
+          </w:p>
+        </w:tc>
+        <w:tc>
+          <w:tcPr>
+            <w:tcW w:type="dxa" w:w="1568"/>
+            <w:shd w:val="clear" w:color="auto" w:fill="FCE4D6"/>
+          </w:tcPr>
+          <w:p>
+            <w:pPr>
+              <w:jc w:val="center"/>
+            </w:pPr>
+            <w:r>
+              <w:t>50</w:t>
+            </w:r>
+          </w:p>
+        </w:tc>
+        <w:tc>
+          <w:tcPr>
+            <w:tcW w:type="dxa" w:w="1568"/>
+            <w:shd w:val="clear" w:color="auto" w:fill="FCE4D6"/>
+          </w:tcPr>
+          <w:p>
+            <w:pPr>
+              <w:jc w:val="center"/>
+            </w:pPr>
+            <w:r>
+              <w:t>32</w:t>
+            </w:r>
+          </w:p>
+        </w:tc>
+        <w:tc>
+          <w:tcPr>
+            <w:tcW w:type="dxa" w:w="1568"/>
+            <w:shd w:val="clear" w:color="auto" w:fill="FCE4D6"/>
+          </w:tcPr>
+          <w:p>
+            <w:pPr>
+              <w:jc w:val="center"/>
+            </w:pPr>
+            <w:r>
+              <w:t>0.2</w:t>
+            </w:r>
+          </w:p>
+        </w:tc>
+        <w:tc>
+          <w:tcPr>
+            <w:tcW w:type="dxa" w:w="1568"/>
+            <w:shd w:val="clear" w:color="auto" w:fill="FCE4D6"/>
+          </w:tcPr>
+          <w:p>
+            <w:pPr>
+              <w:jc w:val="center"/>
+            </w:pPr>
+            <w:r>
+              <w:t>1,213.05</w:t>
+            </w:r>
+          </w:p>
+        </w:tc>
+        <w:tc>
+          <w:tcPr>
+            <w:tcW w:type="dxa" w:w="1568"/>
+            <w:shd w:val="clear" w:color="auto" w:fill="FCE4D6"/>
+          </w:tcPr>
+          <w:p>
+            <w:pPr>
+              <w:jc w:val="center"/>
+            </w:pPr>
+            <w:r>
+              <w:t>1,209.57</w:t>
+            </w:r>
+          </w:p>
+        </w:tc>
+      </w:tr>
+      <w:tr>
+        <w:tc>
+          <w:tcPr>
+            <w:tcW w:type="dxa" w:w="1568"/>
+            <w:shd w:val="clear" w:color="auto" w:fill="FCE4D6"/>
+          </w:tcPr>
+          <w:p>
+            <w:pPr>
+              <w:jc w:val="center"/>
+            </w:pPr>
+            <w:r>
+              <w:t>Worst 3</w:t>
+            </w:r>
+          </w:p>
+        </w:tc>
+        <w:tc>
+          <w:tcPr>
+            <w:tcW w:type="dxa" w:w="1568"/>
+            <w:shd w:val="clear" w:color="auto" w:fill="FCE4D6"/>
+          </w:tcPr>
+          <w:p>
+            <w:pPr>
+              <w:jc w:val="center"/>
+            </w:pPr>
+            <w:r>
+              <w:t>50</w:t>
+            </w:r>
+          </w:p>
+        </w:tc>
+        <w:tc>
+          <w:tcPr>
+            <w:tcW w:type="dxa" w:w="1568"/>
+            <w:shd w:val="clear" w:color="auto" w:fill="FCE4D6"/>
+          </w:tcPr>
+          <w:p>
+            <w:pPr>
+              <w:jc w:val="center"/>
+            </w:pPr>
+            <w:r>
+              <w:t>64</w:t>
+            </w:r>
+          </w:p>
+        </w:tc>
+        <w:tc>
+          <w:tcPr>
+            <w:tcW w:type="dxa" w:w="1568"/>
+            <w:shd w:val="clear" w:color="auto" w:fill="FCE4D6"/>
+          </w:tcPr>
+          <w:p>
+            <w:pPr>
+              <w:jc w:val="center"/>
+            </w:pPr>
+            <w:r>
+              <w:t>0.3</w:t>
+            </w:r>
+          </w:p>
+        </w:tc>
+        <w:tc>
+          <w:tcPr>
+            <w:tcW w:type="dxa" w:w="1568"/>
+            <w:shd w:val="clear" w:color="auto" w:fill="FCE4D6"/>
+          </w:tcPr>
+          <w:p>
+            <w:pPr>
+              <w:jc w:val="center"/>
+            </w:pPr>
+            <w:r>
+              <w:t>1,173.35</w:t>
+            </w:r>
+          </w:p>
+        </w:tc>
+        <w:tc>
+          <w:tcPr>
+            <w:tcW w:type="dxa" w:w="1568"/>
+            <w:shd w:val="clear" w:color="auto" w:fill="FCE4D6"/>
+          </w:tcPr>
+          <w:p>
+            <w:pPr>
+              <w:jc w:val="center"/>
+            </w:pPr>
+            <w:r>
+              <w:t>1,214.06</w:t>
+            </w:r>
+          </w:p>
+        </w:tc>
+      </w:tr>
+    </w:tbl>
+    <w:p>
+      <w:r>
+        <w:t>Worst 3 공통점: window=50 + dropout=0.3 -&gt; 긴 시퀀스에 강한 드롭아웃은 정보 손실 유발.</w:t>
+        <w:br/>
+        <w:t>Best-Worst OOS RMSE 차이: 956.05 vs 1,214.06 (차이 258.01)</w:t>
+      </w:r>
+    </w:p>
+    <w:p>
+      <w:r>
+        <w:br w:type="page"/>
+      </w:r>
+    </w:p>
+    <w:p>
+      <w:pPr>
+        <w:pStyle w:val="Heading1"/>
+      </w:pPr>
+      <w:r>
+        <w:t>IX. ML+DL 통합 시스템 성능 분석</w:t>
+      </w:r>
+    </w:p>
+    <w:p>
+      <w:r>
+        <w:rPr>
+          <w:b/>
+        </w:rPr>
+        <w:t>ML 단독보다 ML+DL 통합 시스템이 예지보전 목적에서 종합적으로 우수합니다. ML은 '고장 발생 여부(Yes/No)'만 판단하지만, ML+DL은 '고장 감지 + 잔여수명(RUL) 예측'을 동시에 제공하여 '언제 정비해야 하는가'까지 답합니다.</w:t>
+      </w:r>
+    </w:p>
+    <w:p>
+      <w:pPr>
+        <w:pStyle w:val="Heading2"/>
+      </w:pPr>
+      <w:r>
+        <w:t>9.1 시스템별 역할 및 성능 비교</w:t>
+      </w:r>
+    </w:p>
+    <w:tbl>
+      <w:tblPr>
+        <w:tblStyle w:val="TableGrid"/>
+        <w:tblW w:type="auto" w:w="0"/>
+        <w:tblLook w:firstColumn="1" w:firstRow="1" w:lastColumn="0" w:lastRow="0" w:noHBand="0" w:noVBand="1" w:val="04A0"/>
+      </w:tblPr>
+      <w:tblGrid>
+        <w:gridCol w:w="1881"/>
+        <w:gridCol w:w="1881"/>
+        <w:gridCol w:w="1881"/>
+        <w:gridCol w:w="1881"/>
+        <w:gridCol w:w="1881"/>
+      </w:tblGrid>
+      <w:tr>
+        <w:tc>
+          <w:tcPr>
+            <w:tcW w:type="dxa" w:w="1881"/>
+            <w:shd w:val="clear" w:color="auto" w:fill="4472C4"/>
+          </w:tcPr>
+          <w:p>
+            <w:pPr>
+              <w:jc w:val="center"/>
+            </w:pPr>
+            <w:r>
+              <w:rPr>
+                <w:b/>
+                <w:color w:val="FFFFFF"/>
+              </w:rPr>
+              <w:t>시스템</w:t>
+            </w:r>
+          </w:p>
+        </w:tc>
+        <w:tc>
+          <w:tcPr>
+            <w:tcW w:type="dxa" w:w="1881"/>
+            <w:shd w:val="clear" w:color="auto" w:fill="4472C4"/>
+          </w:tcPr>
+          <w:p>
+            <w:pPr>
+              <w:jc w:val="center"/>
+            </w:pPr>
+            <w:r>
+              <w:rPr>
+                <w:b/>
+                <w:color w:val="FFFFFF"/>
+              </w:rPr>
+              <w:t>제공 정보</w:t>
+            </w:r>
+          </w:p>
+        </w:tc>
+        <w:tc>
+          <w:tcPr>
+            <w:tcW w:type="dxa" w:w="1881"/>
+            <w:shd w:val="clear" w:color="auto" w:fill="4472C4"/>
+          </w:tcPr>
+          <w:p>
+            <w:pPr>
+              <w:jc w:val="center"/>
+            </w:pPr>
+            <w:r>
+              <w:rPr>
+                <w:b/>
+                <w:color w:val="FFFFFF"/>
+              </w:rPr>
+              <w:t>핵심 지표</w:t>
+            </w:r>
+          </w:p>
+        </w:tc>
+        <w:tc>
+          <w:tcPr>
+            <w:tcW w:type="dxa" w:w="1881"/>
+            <w:shd w:val="clear" w:color="auto" w:fill="4472C4"/>
+          </w:tcPr>
+          <w:p>
+            <w:pPr>
+              <w:jc w:val="center"/>
+            </w:pPr>
+            <w:r>
+              <w:rPr>
+                <w:b/>
+                <w:color w:val="FFFFFF"/>
+              </w:rPr>
+              <w:t>한계</w:t>
+            </w:r>
+          </w:p>
+        </w:tc>
+        <w:tc>
+          <w:tcPr>
+            <w:tcW w:type="dxa" w:w="1881"/>
+            <w:shd w:val="clear" w:color="auto" w:fill="4472C4"/>
+          </w:tcPr>
+          <w:p>
+            <w:pPr>
+              <w:jc w:val="center"/>
+            </w:pPr>
+            <w:r>
+              <w:rPr>
+                <w:b/>
+                <w:color w:val="FFFFFF"/>
+              </w:rPr>
+              <w:t>비고</w:t>
+            </w:r>
+          </w:p>
+        </w:tc>
+      </w:tr>
+      <w:tr>
+        <w:tc>
+          <w:tcPr>
+            <w:tcW w:type="dxa" w:w="1881"/>
+          </w:tcPr>
+          <w:p>
+            <w:pPr>
+              <w:jc w:val="center"/>
+            </w:pPr>
+            <w:r>
+              <w:t>ML 단독 (LR 최우수)</w:t>
+            </w:r>
+          </w:p>
+        </w:tc>
+        <w:tc>
+          <w:tcPr>
+            <w:tcW w:type="dxa" w:w="1881"/>
+          </w:tcPr>
+          <w:p>
+            <w:pPr>
+              <w:jc w:val="center"/>
+            </w:pPr>
+            <w:r>
+              <w:t>고장 여부 (Yes/No)</w:t>
+            </w:r>
+          </w:p>
+        </w:tc>
+        <w:tc>
+          <w:tcPr>
+            <w:tcW w:type="dxa" w:w="1881"/>
+          </w:tcPr>
+          <w:p>
+            <w:pPr>
+              <w:jc w:val="center"/>
+            </w:pPr>
+            <w:r>
+              <w:t>Recall 89.0% / ROC-AUC 0.997</w:t>
+            </w:r>
+          </w:p>
+        </w:tc>
+        <w:tc>
+          <w:tcPr>
+            <w:tcW w:type="dxa" w:w="1881"/>
+          </w:tcPr>
+          <w:p>
+            <w:pPr>
+              <w:jc w:val="center"/>
+            </w:pPr>
+            <w:r>
+              <w:t>RUL 정량화 불가 - 정비 시점 판단 어려움</w:t>
+            </w:r>
+          </w:p>
+        </w:tc>
+        <w:tc>
+          <w:tcPr>
+            <w:tcW w:type="dxa" w:w="1881"/>
+          </w:tcPr>
+          <w:p>
+            <w:pPr>
+              <w:jc w:val="center"/>
+            </w:pPr>
+            <w:r>
+              <w:t>분류만 해결</w:t>
+            </w:r>
+          </w:p>
+        </w:tc>
+      </w:tr>
+      <w:tr>
+        <w:tc>
+          <w:tcPr>
+            <w:tcW w:type="dxa" w:w="1881"/>
+          </w:tcPr>
+          <w:p>
+            <w:pPr>
+              <w:jc w:val="center"/>
+            </w:pPr>
+            <w:r>
+              <w:t>DL 단독 (GRU 최우수)</w:t>
+            </w:r>
+          </w:p>
+        </w:tc>
+        <w:tc>
+          <w:tcPr>
+            <w:tcW w:type="dxa" w:w="1881"/>
+          </w:tcPr>
+          <w:p>
+            <w:pPr>
+              <w:jc w:val="center"/>
+            </w:pPr>
+            <w:r>
+              <w:t>잔여수명 수치 (RUL)</w:t>
+            </w:r>
+          </w:p>
+        </w:tc>
+        <w:tc>
+          <w:tcPr>
+            <w:tcW w:type="dxa" w:w="1881"/>
+          </w:tcPr>
+          <w:p>
+            <w:pPr>
+              <w:jc w:val="center"/>
+            </w:pPr>
+            <w:r>
+              <w:t>OOS RMSE 909.96 / MAE 741.50</w:t>
+            </w:r>
+          </w:p>
+        </w:tc>
+        <w:tc>
+          <w:tcPr>
+            <w:tcW w:type="dxa" w:w="1881"/>
+          </w:tcPr>
+          <w:p>
+            <w:pPr>
+              <w:jc w:val="center"/>
+            </w:pPr>
+            <w:r>
+              <w:t>고장 감지 미포함 - 수동 트리거 필요</w:t>
+            </w:r>
+          </w:p>
+        </w:tc>
+        <w:tc>
+          <w:tcPr>
+            <w:tcW w:type="dxa" w:w="1881"/>
+          </w:tcPr>
+          <w:p>
+            <w:pPr>
+              <w:jc w:val="center"/>
+            </w:pPr>
+            <w:r>
+              <w:t>회귀만 해결</w:t>
+            </w:r>
+          </w:p>
+        </w:tc>
+      </w:tr>
+      <w:tr>
+        <w:tc>
+          <w:tcPr>
+            <w:tcW w:type="dxa" w:w="1881"/>
+            <w:shd w:val="clear" w:color="auto" w:fill="D9E1F2"/>
+          </w:tcPr>
+          <w:p>
+            <w:pPr>
+              <w:jc w:val="center"/>
+            </w:pPr>
+            <w:r>
+              <w:rPr>
+                <w:b/>
+              </w:rPr>
+              <w:t>ML+DL 통합 (LR+GRU)</w:t>
+            </w:r>
+          </w:p>
+        </w:tc>
+        <w:tc>
+          <w:tcPr>
+            <w:tcW w:type="dxa" w:w="1881"/>
+            <w:shd w:val="clear" w:color="auto" w:fill="D9E1F2"/>
+          </w:tcPr>
+          <w:p>
+            <w:pPr>
+              <w:jc w:val="center"/>
+            </w:pPr>
+            <w:r>
+              <w:rPr>
+                <w:b/>
+              </w:rPr>
+              <w:t>고장 감지 + RUL 예측</w:t>
+            </w:r>
+          </w:p>
+        </w:tc>
+        <w:tc>
+          <w:tcPr>
+            <w:tcW w:type="dxa" w:w="1881"/>
+            <w:shd w:val="clear" w:color="auto" w:fill="D9E1F2"/>
+          </w:tcPr>
+          <w:p>
+            <w:pPr>
+              <w:jc w:val="center"/>
+            </w:pPr>
+            <w:r>
+              <w:rPr>
+                <w:b/>
+              </w:rPr>
+              <w:t>Recall 89.0% &amp; RMSE 909.96</w:t>
+            </w:r>
+          </w:p>
+        </w:tc>
+        <w:tc>
+          <w:tcPr>
+            <w:tcW w:type="dxa" w:w="1881"/>
+            <w:shd w:val="clear" w:color="auto" w:fill="D9E1F2"/>
+          </w:tcPr>
+          <w:p>
+            <w:pPr>
+              <w:jc w:val="center"/>
+            </w:pPr>
+            <w:r>
+              <w:rPr>
+                <w:b/>
+              </w:rPr>
+              <w:t>두 모델 운영 비용 증가</w:t>
+            </w:r>
+          </w:p>
+        </w:tc>
+        <w:tc>
+          <w:tcPr>
+            <w:tcW w:type="dxa" w:w="1881"/>
+            <w:shd w:val="clear" w:color="auto" w:fill="D9E1F2"/>
+          </w:tcPr>
+          <w:p>
+            <w:pPr>
+              <w:jc w:val="center"/>
+            </w:pPr>
+            <w:r>
+              <w:rPr>
+                <w:b/>
+              </w:rPr>
+              <w:t>★ 완전한 예지보전</w:t>
+            </w:r>
+          </w:p>
+        </w:tc>
+      </w:tr>
+    </w:tbl>
+    <w:p>
+      <w:pPr>
+        <w:pStyle w:val="Heading2"/>
+      </w:pPr>
+      <w:r>
+        <w:t>9.2 통합 시스템의 정량적 우수성</w:t>
+      </w:r>
+    </w:p>
+    <w:tbl>
+      <w:tblPr>
+        <w:tblStyle w:val="TableGrid"/>
+        <w:tblW w:type="auto" w:w="0"/>
+        <w:tblLook w:firstColumn="1" w:firstRow="1" w:lastColumn="0" w:lastRow="0" w:noHBand="0" w:noVBand="1" w:val="04A0"/>
+      </w:tblPr>
+      <w:tblGrid>
+        <w:gridCol w:w="2351"/>
+        <w:gridCol w:w="2351"/>
+        <w:gridCol w:w="2351"/>
+        <w:gridCol w:w="2351"/>
+      </w:tblGrid>
+      <w:tr>
+        <w:tc>
+          <w:tcPr>
+            <w:tcW w:type="dxa" w:w="2351"/>
+            <w:shd w:val="clear" w:color="auto" w:fill="4472C4"/>
+          </w:tcPr>
+          <w:p>
+            <w:pPr>
+              <w:jc w:val="center"/>
+            </w:pPr>
+            <w:r>
+              <w:rPr>
+                <w:b/>
+                <w:color w:val="FFFFFF"/>
+              </w:rPr>
+              <w:t>평가 항목</w:t>
+            </w:r>
+          </w:p>
+        </w:tc>
+        <w:tc>
+          <w:tcPr>
+            <w:tcW w:type="dxa" w:w="2351"/>
+            <w:shd w:val="clear" w:color="auto" w:fill="4472C4"/>
+          </w:tcPr>
+          <w:p>
+            <w:pPr>
+              <w:jc w:val="center"/>
+            </w:pPr>
+            <w:r>
+              <w:rPr>
+                <w:b/>
+                <w:color w:val="FFFFFF"/>
+              </w:rPr>
+              <w:t>ML 단독</w:t>
+            </w:r>
+          </w:p>
+        </w:tc>
+        <w:tc>
+          <w:tcPr>
+            <w:tcW w:type="dxa" w:w="2351"/>
+            <w:shd w:val="clear" w:color="auto" w:fill="4472C4"/>
+          </w:tcPr>
+          <w:p>
+            <w:pPr>
+              <w:jc w:val="center"/>
+            </w:pPr>
+            <w:r>
+              <w:rPr>
+                <w:b/>
+                <w:color w:val="FFFFFF"/>
+              </w:rPr>
+              <w:t>ML+DL 통합</w:t>
+            </w:r>
+          </w:p>
+        </w:tc>
+        <w:tc>
+          <w:tcPr>
+            <w:tcW w:type="dxa" w:w="2351"/>
+            <w:shd w:val="clear" w:color="auto" w:fill="4472C4"/>
+          </w:tcPr>
+          <w:p>
+            <w:pPr>
+              <w:jc w:val="center"/>
+            </w:pPr>
+            <w:r>
+              <w:rPr>
+                <w:b/>
+                <w:color w:val="FFFFFF"/>
+              </w:rPr>
+              <w:t>개선 효과</w:t>
+            </w:r>
+          </w:p>
+        </w:tc>
+      </w:tr>
+      <w:tr>
+        <w:tc>
+          <w:tcPr>
+            <w:tcW w:type="dxa" w:w="2351"/>
+          </w:tcPr>
+          <w:p>
+            <w:pPr>
+              <w:jc w:val="center"/>
+            </w:pPr>
+            <w:r>
+              <w:t>고장 감지 Recall</w:t>
+            </w:r>
+          </w:p>
+        </w:tc>
+        <w:tc>
+          <w:tcPr>
+            <w:tcW w:type="dxa" w:w="2351"/>
+          </w:tcPr>
+          <w:p>
+            <w:pPr>
+              <w:jc w:val="center"/>
+            </w:pPr>
+            <w:r>
+              <w:t>89.0%</w:t>
+            </w:r>
+          </w:p>
+        </w:tc>
+        <w:tc>
+          <w:tcPr>
+            <w:tcW w:type="dxa" w:w="2351"/>
+          </w:tcPr>
+          <w:p>
+            <w:pPr>
+              <w:jc w:val="center"/>
+            </w:pPr>
+            <w:r>
+              <w:t>89.0%</w:t>
+            </w:r>
+          </w:p>
+        </w:tc>
+        <w:tc>
+          <w:tcPr>
+            <w:tcW w:type="dxa" w:w="2351"/>
+          </w:tcPr>
+          <w:p>
+            <w:pPr>
+              <w:jc w:val="center"/>
+            </w:pPr>
+            <w:r>
+              <w:t>동일 (ML 기여분 유지)</w:t>
+            </w:r>
+          </w:p>
+        </w:tc>
+      </w:tr>
+      <w:tr>
+        <w:tc>
+          <w:tcPr>
+            <w:tcW w:type="dxa" w:w="2351"/>
+          </w:tcPr>
+          <w:p>
+            <w:pPr>
+              <w:jc w:val="center"/>
+            </w:pPr>
+            <w:r>
+              <w:t>고장 감지 ROC-AUC</w:t>
+            </w:r>
+          </w:p>
+        </w:tc>
+        <w:tc>
+          <w:tcPr>
+            <w:tcW w:type="dxa" w:w="2351"/>
+          </w:tcPr>
+          <w:p>
+            <w:pPr>
+              <w:jc w:val="center"/>
+            </w:pPr>
+            <w:r>
+              <w:t>0.997</w:t>
+            </w:r>
+          </w:p>
+        </w:tc>
+        <w:tc>
+          <w:tcPr>
+            <w:tcW w:type="dxa" w:w="2351"/>
+          </w:tcPr>
+          <w:p>
+            <w:pPr>
+              <w:jc w:val="center"/>
+            </w:pPr>
+            <w:r>
+              <w:t>0.997</w:t>
+            </w:r>
+          </w:p>
+        </w:tc>
+        <w:tc>
+          <w:tcPr>
+            <w:tcW w:type="dxa" w:w="2351"/>
+          </w:tcPr>
+          <w:p>
+            <w:pPr>
+              <w:jc w:val="center"/>
+            </w:pPr>
+            <w:r>
+              <w:t>동일 (ML 기여분 유지)</w:t>
+            </w:r>
+          </w:p>
+        </w:tc>
+      </w:tr>
+      <w:tr>
+        <w:tc>
+          <w:tcPr>
+            <w:tcW w:type="dxa" w:w="2351"/>
+          </w:tcPr>
+          <w:p>
+            <w:pPr>
+              <w:jc w:val="center"/>
+            </w:pPr>
+            <w:r>
+              <w:t>RUL 예측 RMSE</w:t>
+            </w:r>
+          </w:p>
+        </w:tc>
+        <w:tc>
+          <w:tcPr>
+            <w:tcW w:type="dxa" w:w="2351"/>
+          </w:tcPr>
+          <w:p>
+            <w:pPr>
+              <w:jc w:val="center"/>
+            </w:pPr>
+            <w:r>
+              <w:t>RF 954.5 (ML 회귀)</w:t>
+            </w:r>
+          </w:p>
+        </w:tc>
+        <w:tc>
+          <w:tcPr>
+            <w:tcW w:type="dxa" w:w="2351"/>
+          </w:tcPr>
+          <w:p>
+            <w:pPr>
+              <w:jc w:val="center"/>
+            </w:pPr>
+            <w:r>
+              <w:t>GRU 909.96</w:t>
+            </w:r>
+          </w:p>
+        </w:tc>
+        <w:tc>
+          <w:tcPr>
+            <w:tcW w:type="dxa" w:w="2351"/>
+          </w:tcPr>
+          <w:p>
+            <w:pPr>
+              <w:jc w:val="center"/>
+            </w:pPr>
+            <w:r>
+              <w:t>DL 적용으로 4.7% 개선</w:t>
+            </w:r>
+          </w:p>
+        </w:tc>
+      </w:tr>
+      <w:tr>
+        <w:tc>
+          <w:tcPr>
+            <w:tcW w:type="dxa" w:w="2351"/>
+            <w:shd w:val="clear" w:color="auto" w:fill="E2EFDA"/>
+          </w:tcPr>
+          <w:p>
+            <w:pPr>
+              <w:jc w:val="center"/>
+            </w:pPr>
+            <w:r>
+              <w:rPr>
+                <w:b/>
+              </w:rPr>
+              <w:t>제공 정보 범위</w:t>
+            </w:r>
+          </w:p>
+        </w:tc>
+        <w:tc>
+          <w:tcPr>
+            <w:tcW w:type="dxa" w:w="2351"/>
+            <w:shd w:val="clear" w:color="auto" w:fill="E2EFDA"/>
+          </w:tcPr>
+          <w:p>
+            <w:pPr>
+              <w:jc w:val="center"/>
+            </w:pPr>
+            <w:r>
+              <w:rPr>
+                <w:b/>
+              </w:rPr>
+              <w:t>고장 여부만</w:t>
+            </w:r>
+          </w:p>
+        </w:tc>
+        <w:tc>
+          <w:tcPr>
+            <w:tcW w:type="dxa" w:w="2351"/>
+            <w:shd w:val="clear" w:color="auto" w:fill="E2EFDA"/>
+          </w:tcPr>
+          <w:p>
+            <w:pPr>
+              <w:jc w:val="center"/>
+            </w:pPr>
+            <w:r>
+              <w:rPr>
+                <w:b/>
+              </w:rPr>
+              <w:t>고장 여부 + 잔여수명</w:t>
+            </w:r>
+          </w:p>
+        </w:tc>
+        <w:tc>
+          <w:tcPr>
+            <w:tcW w:type="dxa" w:w="2351"/>
+            <w:shd w:val="clear" w:color="auto" w:fill="E2EFDA"/>
+          </w:tcPr>
+          <w:p>
+            <w:pPr>
+              <w:jc w:val="center"/>
+            </w:pPr>
+            <w:r>
+              <w:rPr>
+                <w:b/>
+              </w:rPr>
+              <w:t>정보량 2배 - 정비 타이밍 최적화 가능</w:t>
+            </w:r>
+          </w:p>
+        </w:tc>
+      </w:tr>
+    </w:tbl>
+    <w:p>
+      <w:r>
+        <w:t>결론: ML+DL 통합 시스템은 '고장이 발생하는가(ML)'와 '고장 후 얼마나 더 운전 가능한가(DL)'를 동시에 제공합니다. ML 단독 대비 RUL 예측 정밀도 4.7% 향상, 불필요한 예방 정비 감소, 설비 가동률 향상이 기대됩니다.</w:t>
+      </w:r>
+    </w:p>
+    <w:p>
+      <w:r>
+        <w:br w:type="page"/>
+      </w:r>
+    </w:p>
+    <w:p>
+      <w:pPr>
+        <w:pStyle w:val="Heading1"/>
+      </w:pPr>
+      <w:r>
+        <w:t>X. 향후 성능 개선 계획 (ML + DL + LLM/RAG)</w:t>
+      </w:r>
+    </w:p>
+    <w:p>
+      <w:r>
+        <w:t>현재 ML+DL 통합 시스템에 LLM(대형 언어 모델)과 RAG(검색 증강 생성)를 추가하면 단순 수치 예측을 넘어 자연어 기반 진단 및 의사결정 지원이 가능합니다.</w:t>
+      </w:r>
+    </w:p>
+    <w:p>
+      <w:pPr>
+        <w:pStyle w:val="Heading2"/>
+      </w:pPr>
+      <w:r>
+        <w:t>10.1 3단계 확장 아키텍처</w:t>
+      </w:r>
+    </w:p>
+    <w:tbl>
+      <w:tblPr>
+        <w:tblStyle w:val="TableGrid"/>
+        <w:tblW w:type="auto" w:w="0"/>
+        <w:tblLook w:firstColumn="1" w:firstRow="1" w:lastColumn="0" w:lastRow="0" w:noHBand="0" w:noVBand="1" w:val="04A0"/>
+      </w:tblPr>
+      <w:tblGrid>
+        <w:gridCol w:w="2351"/>
+        <w:gridCol w:w="2351"/>
+        <w:gridCol w:w="2351"/>
+        <w:gridCol w:w="2351"/>
+      </w:tblGrid>
+      <w:tr>
+        <w:tc>
+          <w:tcPr>
+            <w:tcW w:type="dxa" w:w="2351"/>
+            <w:shd w:val="clear" w:color="auto" w:fill="4472C4"/>
+          </w:tcPr>
+          <w:p>
+            <w:pPr>
+              <w:jc w:val="center"/>
+            </w:pPr>
+            <w:r>
+              <w:rPr>
+                <w:b/>
+                <w:color w:val="FFFFFF"/>
+              </w:rPr>
+              <w:t>단계</w:t>
+            </w:r>
+          </w:p>
+        </w:tc>
+        <w:tc>
+          <w:tcPr>
+            <w:tcW w:type="dxa" w:w="2351"/>
+            <w:shd w:val="clear" w:color="auto" w:fill="4472C4"/>
+          </w:tcPr>
+          <w:p>
+            <w:pPr>
+              <w:jc w:val="center"/>
+            </w:pPr>
+            <w:r>
+              <w:rPr>
+                <w:b/>
+                <w:color w:val="FFFFFF"/>
+              </w:rPr>
+              <w:t>구성 요소</w:t>
+            </w:r>
+          </w:p>
+        </w:tc>
+        <w:tc>
+          <w:tcPr>
+            <w:tcW w:type="dxa" w:w="2351"/>
+            <w:shd w:val="clear" w:color="auto" w:fill="4472C4"/>
+          </w:tcPr>
+          <w:p>
+            <w:pPr>
+              <w:jc w:val="center"/>
+            </w:pPr>
+            <w:r>
+              <w:rPr>
+                <w:b/>
+                <w:color w:val="FFFFFF"/>
+              </w:rPr>
+              <w:t>역할</w:t>
+            </w:r>
+          </w:p>
+        </w:tc>
+        <w:tc>
+          <w:tcPr>
+            <w:tcW w:type="dxa" w:w="2351"/>
+            <w:shd w:val="clear" w:color="auto" w:fill="4472C4"/>
+          </w:tcPr>
+          <w:p>
+            <w:pPr>
+              <w:jc w:val="center"/>
+            </w:pPr>
+            <w:r>
+              <w:rPr>
+                <w:b/>
+                <w:color w:val="FFFFFF"/>
+              </w:rPr>
+              <w:t>기대 출력</w:t>
+            </w:r>
+          </w:p>
+        </w:tc>
+      </w:tr>
+      <w:tr>
+        <w:tc>
+          <w:tcPr>
+            <w:tcW w:type="dxa" w:w="2351"/>
+            <w:shd w:val="clear" w:color="auto" w:fill="E2EFDA"/>
+          </w:tcPr>
+          <w:p>
+            <w:pPr>
+              <w:jc w:val="center"/>
+            </w:pPr>
+            <w:r>
+              <w:t>1단계 (완료)</w:t>
+            </w:r>
+          </w:p>
+        </w:tc>
+        <w:tc>
+          <w:tcPr>
+            <w:tcW w:type="dxa" w:w="2351"/>
+            <w:shd w:val="clear" w:color="auto" w:fill="E2EFDA"/>
+          </w:tcPr>
+          <w:p>
+            <w:pPr>
+              <w:jc w:val="center"/>
+            </w:pPr>
+            <w:r>
+              <w:t>ML (LR/RF/XGB)</w:t>
+            </w:r>
+          </w:p>
+        </w:tc>
+        <w:tc>
+          <w:tcPr>
+            <w:tcW w:type="dxa" w:w="2351"/>
+            <w:shd w:val="clear" w:color="auto" w:fill="E2EFDA"/>
+          </w:tcPr>
+          <w:p>
+            <w:pPr>
+              <w:jc w:val="center"/>
+            </w:pPr>
+            <w:r>
+              <w:t>고장 감지 - Binary Classification</w:t>
+            </w:r>
+          </w:p>
+        </w:tc>
+        <w:tc>
+          <w:tcPr>
+            <w:tcW w:type="dxa" w:w="2351"/>
+            <w:shd w:val="clear" w:color="auto" w:fill="E2EFDA"/>
+          </w:tcPr>
+          <w:p>
+            <w:pPr>
+              <w:jc w:val="center"/>
+            </w:pPr>
+            <w:r>
+              <w:t>고장 여부 + 확률값</w:t>
+            </w:r>
+          </w:p>
+        </w:tc>
+      </w:tr>
+      <w:tr>
+        <w:tc>
+          <w:tcPr>
+            <w:tcW w:type="dxa" w:w="2351"/>
+            <w:shd w:val="clear" w:color="auto" w:fill="E2EFDA"/>
+          </w:tcPr>
+          <w:p>
+            <w:pPr>
+              <w:jc w:val="center"/>
+            </w:pPr>
+            <w:r>
+              <w:t>2단계 (완료)</w:t>
+            </w:r>
+          </w:p>
+        </w:tc>
+        <w:tc>
+          <w:tcPr>
+            <w:tcW w:type="dxa" w:w="2351"/>
+            <w:shd w:val="clear" w:color="auto" w:fill="E2EFDA"/>
+          </w:tcPr>
+          <w:p>
+            <w:pPr>
+              <w:jc w:val="center"/>
+            </w:pPr>
+            <w:r>
+              <w:t>DL (GRU/LSTM)</w:t>
+            </w:r>
+          </w:p>
+        </w:tc>
+        <w:tc>
+          <w:tcPr>
+            <w:tcW w:type="dxa" w:w="2351"/>
+            <w:shd w:val="clear" w:color="auto" w:fill="E2EFDA"/>
+          </w:tcPr>
+          <w:p>
+            <w:pPr>
+              <w:jc w:val="center"/>
+            </w:pPr>
+            <w:r>
+              <w:t>RUL 예측 - Regression</w:t>
+            </w:r>
+          </w:p>
+        </w:tc>
+        <w:tc>
+          <w:tcPr>
+            <w:tcW w:type="dxa" w:w="2351"/>
+            <w:shd w:val="clear" w:color="auto" w:fill="E2EFDA"/>
+          </w:tcPr>
+          <w:p>
+            <w:pPr>
+              <w:jc w:val="center"/>
+            </w:pPr>
+            <w:r>
+              <w:t>잔여수명 수치 (사이클)</w:t>
+            </w:r>
+          </w:p>
+        </w:tc>
+      </w:tr>
+      <w:tr>
+        <w:tc>
+          <w:tcPr>
+            <w:tcW w:type="dxa" w:w="2351"/>
+            <w:shd w:val="clear" w:color="auto" w:fill="FFF2CC"/>
+          </w:tcPr>
+          <w:p>
+            <w:pPr>
+              <w:jc w:val="center"/>
+            </w:pPr>
+            <w:r>
+              <w:rPr>
+                <w:b/>
+              </w:rPr>
+              <w:t>3단계 (계획)</w:t>
+            </w:r>
+          </w:p>
+        </w:tc>
+        <w:tc>
+          <w:tcPr>
+            <w:tcW w:type="dxa" w:w="2351"/>
+            <w:shd w:val="clear" w:color="auto" w:fill="FFF2CC"/>
+          </w:tcPr>
+          <w:p>
+            <w:pPr>
+              <w:jc w:val="center"/>
+            </w:pPr>
+            <w:r>
+              <w:rPr>
+                <w:b/>
+              </w:rPr>
+              <w:t>LLM + RAG</w:t>
+            </w:r>
+          </w:p>
+        </w:tc>
+        <w:tc>
+          <w:tcPr>
+            <w:tcW w:type="dxa" w:w="2351"/>
+            <w:shd w:val="clear" w:color="auto" w:fill="FFF2CC"/>
+          </w:tcPr>
+          <w:p>
+            <w:pPr>
+              <w:jc w:val="center"/>
+            </w:pPr>
+            <w:r>
+              <w:rPr>
+                <w:b/>
+              </w:rPr>
+              <w:t>진단 해설 생성 + 유사 사례 검색</w:t>
+            </w:r>
+          </w:p>
+        </w:tc>
+        <w:tc>
+          <w:tcPr>
+            <w:tcW w:type="dxa" w:w="2351"/>
+            <w:shd w:val="clear" w:color="auto" w:fill="FFF2CC"/>
+          </w:tcPr>
+          <w:p>
+            <w:pPr>
+              <w:jc w:val="center"/>
+            </w:pPr>
+            <w:r>
+              <w:rPr>
+                <w:b/>
+              </w:rPr>
+              <w:t>자연어 진단 리포트 + 정비 권고안</w:t>
+            </w:r>
+          </w:p>
+        </w:tc>
+      </w:tr>
+    </w:tbl>
+    <w:p>
+      <w:pPr>
+        <w:pStyle w:val="Heading2"/>
+      </w:pPr>
+      <w:r>
+        <w:t>10.2 예상 개선 항목 및 기대 효과</w:t>
+      </w:r>
+    </w:p>
+    <w:tbl>
+      <w:tblPr>
+        <w:tblStyle w:val="TableGrid"/>
+        <w:tblW w:type="auto" w:w="0"/>
+        <w:tblLook w:firstColumn="1" w:firstRow="1" w:lastColumn="0" w:lastRow="0" w:noHBand="0" w:noVBand="1" w:val="04A0"/>
+      </w:tblPr>
+      <w:tblGrid>
+        <w:gridCol w:w="2351"/>
+        <w:gridCol w:w="2351"/>
+        <w:gridCol w:w="2351"/>
+        <w:gridCol w:w="2351"/>
+      </w:tblGrid>
+      <w:tr>
+        <w:tc>
+          <w:tcPr>
+            <w:tcW w:type="dxa" w:w="2351"/>
+            <w:shd w:val="clear" w:color="auto" w:fill="4472C4"/>
+          </w:tcPr>
+          <w:p>
+            <w:pPr>
+              <w:jc w:val="center"/>
+            </w:pPr>
+            <w:r>
+              <w:rPr>
+                <w:b/>
+                <w:color w:val="FFFFFF"/>
+              </w:rPr>
+              <w:t>개선 항목</w:t>
+            </w:r>
+          </w:p>
+        </w:tc>
+        <w:tc>
+          <w:tcPr>
+            <w:tcW w:type="dxa" w:w="2351"/>
+            <w:shd w:val="clear" w:color="auto" w:fill="4472C4"/>
+          </w:tcPr>
+          <w:p>
+            <w:pPr>
+              <w:jc w:val="center"/>
+            </w:pPr>
+            <w:r>
+              <w:rPr>
+                <w:b/>
+                <w:color w:val="FFFFFF"/>
+              </w:rPr>
+              <w:t>적용 기술</w:t>
+            </w:r>
+          </w:p>
+        </w:tc>
+        <w:tc>
+          <w:tcPr>
+            <w:tcW w:type="dxa" w:w="2351"/>
+            <w:shd w:val="clear" w:color="auto" w:fill="4472C4"/>
+          </w:tcPr>
+          <w:p>
+            <w:pPr>
+              <w:jc w:val="center"/>
+            </w:pPr>
+            <w:r>
+              <w:rPr>
+                <w:b/>
+                <w:color w:val="FFFFFF"/>
+              </w:rPr>
+              <w:t>현재 한계</w:t>
+            </w:r>
+          </w:p>
+        </w:tc>
+        <w:tc>
+          <w:tcPr>
+            <w:tcW w:type="dxa" w:w="2351"/>
+            <w:shd w:val="clear" w:color="auto" w:fill="4472C4"/>
+          </w:tcPr>
+          <w:p>
+            <w:pPr>
+              <w:jc w:val="center"/>
+            </w:pPr>
+            <w:r>
+              <w:rPr>
+                <w:b/>
+                <w:color w:val="FFFFFF"/>
+              </w:rPr>
+              <w:t>기대 효과</w:t>
+            </w:r>
+          </w:p>
+        </w:tc>
+      </w:tr>
+      <w:tr>
+        <w:tc>
+          <w:tcPr>
+            <w:tcW w:type="dxa" w:w="2351"/>
+            <w:shd w:val="clear" w:color="auto" w:fill="EBF3FB"/>
+          </w:tcPr>
+          <w:p>
+            <w:pPr>
+              <w:jc w:val="center"/>
+            </w:pPr>
+            <w:r>
+              <w:t>자연어 고장 진단</w:t>
+            </w:r>
+          </w:p>
+        </w:tc>
+        <w:tc>
+          <w:tcPr>
+            <w:tcW w:type="dxa" w:w="2351"/>
+            <w:shd w:val="clear" w:color="auto" w:fill="EBF3FB"/>
+          </w:tcPr>
+          <w:p>
+            <w:pPr>
+              <w:jc w:val="center"/>
+            </w:pPr>
+            <w:r>
+              <w:t>LLM (Claude/GPT)</w:t>
+            </w:r>
+          </w:p>
+        </w:tc>
+        <w:tc>
+          <w:tcPr>
+            <w:tcW w:type="dxa" w:w="2351"/>
+            <w:shd w:val="clear" w:color="auto" w:fill="EBF3FB"/>
+          </w:tcPr>
+          <w:p>
+            <w:pPr>
+              <w:jc w:val="center"/>
+            </w:pPr>
+            <w:r>
+              <w:t>RMSE 수치만 제공, 원인 해설 없음</w:t>
+            </w:r>
+          </w:p>
+        </w:tc>
+        <w:tc>
+          <w:tcPr>
+            <w:tcW w:type="dxa" w:w="2351"/>
+            <w:shd w:val="clear" w:color="auto" w:fill="EBF3FB"/>
+          </w:tcPr>
+          <w:p>
+            <w:pPr>
+              <w:jc w:val="center"/>
+            </w:pPr>
+            <w:r>
+              <w:t>'베어링 피로 마모 의심 - 72시간 내 정비 권고' 자연어 리포트</w:t>
+            </w:r>
+          </w:p>
+        </w:tc>
+      </w:tr>
+      <w:tr>
+        <w:tc>
+          <w:tcPr>
+            <w:tcW w:type="dxa" w:w="2351"/>
+          </w:tcPr>
+          <w:p>
+            <w:pPr>
+              <w:jc w:val="center"/>
+            </w:pPr>
+            <w:r>
+              <w:t>유사 고장 사례 검색</w:t>
+            </w:r>
+          </w:p>
+        </w:tc>
+        <w:tc>
+          <w:tcPr>
+            <w:tcW w:type="dxa" w:w="2351"/>
+          </w:tcPr>
+          <w:p>
+            <w:pPr>
+              <w:jc w:val="center"/>
+            </w:pPr>
+            <w:r>
+              <w:t>RAG + 벡터DB (Chroma/Faiss)</w:t>
+            </w:r>
+          </w:p>
+        </w:tc>
+        <w:tc>
+          <w:tcPr>
+            <w:tcW w:type="dxa" w:w="2351"/>
+          </w:tcPr>
+          <w:p>
+            <w:pPr>
+              <w:jc w:val="center"/>
+            </w:pPr>
+            <w:r>
+              <w:t>과거 사례 활용 불가</w:t>
+            </w:r>
+          </w:p>
+        </w:tc>
+        <w:tc>
+          <w:tcPr>
+            <w:tcW w:type="dxa" w:w="2351"/>
+          </w:tcPr>
+          <w:p>
+            <w:pPr>
+              <w:jc w:val="center"/>
+            </w:pPr>
+            <w:r>
+              <w:t>유사 진동 패턴 + 과거 해결 조치 자동 검색 제공</w:t>
+            </w:r>
+          </w:p>
+        </w:tc>
+      </w:tr>
+      <w:tr>
+        <w:tc>
+          <w:tcPr>
+            <w:tcW w:type="dxa" w:w="2351"/>
+            <w:shd w:val="clear" w:color="auto" w:fill="EBF3FB"/>
+          </w:tcPr>
+          <w:p>
+            <w:pPr>
+              <w:jc w:val="center"/>
+            </w:pPr>
+            <w:r>
+              <w:t>다변량 이상 감지</w:t>
+            </w:r>
+          </w:p>
+        </w:tc>
+        <w:tc>
+          <w:tcPr>
+            <w:tcW w:type="dxa" w:w="2351"/>
+            <w:shd w:val="clear" w:color="auto" w:fill="EBF3FB"/>
+          </w:tcPr>
+          <w:p>
+            <w:pPr>
+              <w:jc w:val="center"/>
+            </w:pPr>
+            <w:r>
+              <w:t>Transformer / Attention</w:t>
+            </w:r>
+          </w:p>
+        </w:tc>
+        <w:tc>
+          <w:tcPr>
+            <w:tcW w:type="dxa" w:w="2351"/>
+            <w:shd w:val="clear" w:color="auto" w:fill="EBF3FB"/>
+          </w:tcPr>
+          <w:p>
+            <w:pPr>
+              <w:jc w:val="center"/>
+            </w:pPr>
+            <w:r>
+              <w:t>베어링별 독립 예측</w:t>
+            </w:r>
+          </w:p>
+        </w:tc>
+        <w:tc>
+          <w:tcPr>
+            <w:tcW w:type="dxa" w:w="2351"/>
+            <w:shd w:val="clear" w:color="auto" w:fill="EBF3FB"/>
+          </w:tcPr>
+          <w:p>
+            <w:pPr>
+              <w:jc w:val="center"/>
+            </w:pPr>
+            <w:r>
+              <w:t>복수 센서 상관관계로 복합 고장 조기 감지</w:t>
+            </w:r>
+          </w:p>
+        </w:tc>
+      </w:tr>
+      <w:tr>
+        <w:tc>
+          <w:tcPr>
+            <w:tcW w:type="dxa" w:w="2351"/>
+          </w:tcPr>
+          <w:p>
+            <w:pPr>
+              <w:jc w:val="center"/>
+            </w:pPr>
+            <w:r>
+              <w:t>온라인 학습 (Streaming)</w:t>
+            </w:r>
+          </w:p>
+        </w:tc>
+        <w:tc>
+          <w:tcPr>
+            <w:tcW w:type="dxa" w:w="2351"/>
+          </w:tcPr>
+          <w:p>
+            <w:pPr>
+              <w:jc w:val="center"/>
+            </w:pPr>
+            <w:r>
+              <w:t>Continual Learning</w:t>
+            </w:r>
+          </w:p>
+        </w:tc>
+        <w:tc>
+          <w:tcPr>
+            <w:tcW w:type="dxa" w:w="2351"/>
+          </w:tcPr>
+          <w:p>
+            <w:pPr>
+              <w:jc w:val="center"/>
+            </w:pPr>
+            <w:r>
+              <w:t>정적 모델 - 현장 변화 미반영</w:t>
+            </w:r>
+          </w:p>
+        </w:tc>
+        <w:tc>
+          <w:tcPr>
+            <w:tcW w:type="dxa" w:w="2351"/>
+          </w:tcPr>
+          <w:p>
+            <w:pPr>
+              <w:jc w:val="center"/>
+            </w:pPr>
+            <w:r>
+              <w:t>새 데이터로 점진적 모델 갱신 (데이터 드리프트 대응)</w:t>
+            </w:r>
+          </w:p>
+        </w:tc>
+      </w:tr>
+      <w:tr>
+        <w:tc>
+          <w:tcPr>
+            <w:tcW w:type="dxa" w:w="2351"/>
+            <w:shd w:val="clear" w:color="auto" w:fill="EBF3FB"/>
+          </w:tcPr>
+          <w:p>
+            <w:pPr>
+              <w:jc w:val="center"/>
+            </w:pPr>
+            <w:r>
+              <w:t>설명 가능 AI (XAI)</w:t>
+            </w:r>
+          </w:p>
+        </w:tc>
+        <w:tc>
+          <w:tcPr>
+            <w:tcW w:type="dxa" w:w="2351"/>
+            <w:shd w:val="clear" w:color="auto" w:fill="EBF3FB"/>
+          </w:tcPr>
+          <w:p>
+            <w:pPr>
+              <w:jc w:val="center"/>
+            </w:pPr>
+            <w:r>
+              <w:t>SHAP + LLM 해설</w:t>
+            </w:r>
+          </w:p>
+        </w:tc>
+        <w:tc>
+          <w:tcPr>
+            <w:tcW w:type="dxa" w:w="2351"/>
+            <w:shd w:val="clear" w:color="auto" w:fill="EBF3FB"/>
+          </w:tcPr>
+          <w:p>
+            <w:pPr>
+              <w:jc w:val="center"/>
+            </w:pPr>
+            <w:r>
+              <w:t>예측 근거 불명확 (블랙박스)</w:t>
+            </w:r>
+          </w:p>
+        </w:tc>
+        <w:tc>
+          <w:tcPr>
+            <w:tcW w:type="dxa" w:w="2351"/>
+            <w:shd w:val="clear" w:color="auto" w:fill="EBF3FB"/>
+          </w:tcPr>
+          <w:p>
+            <w:pPr>
+              <w:jc w:val="center"/>
+            </w:pPr>
+            <w:r>
+              <w:t>'h_rms 급상승이 주원인' 특성 기여도 자동 자연어 해설</w:t>
+            </w:r>
+          </w:p>
+        </w:tc>
+      </w:tr>
+      <w:tr>
+        <w:tc>
+          <w:tcPr>
+            <w:tcW w:type="dxa" w:w="2351"/>
+          </w:tcPr>
+          <w:p>
+            <w:pPr>
+              <w:jc w:val="center"/>
+            </w:pPr>
+            <w:r>
+              <w:t>멀티모달 통합</w:t>
+            </w:r>
+          </w:p>
+        </w:tc>
+        <w:tc>
+          <w:tcPr>
+            <w:tcW w:type="dxa" w:w="2351"/>
+          </w:tcPr>
+          <w:p>
+            <w:pPr>
+              <w:jc w:val="center"/>
+            </w:pPr>
+            <w:r>
+              <w:t>LLM Vision + 센서</w:t>
+            </w:r>
+          </w:p>
+        </w:tc>
+        <w:tc>
+          <w:tcPr>
+            <w:tcW w:type="dxa" w:w="2351"/>
+          </w:tcPr>
+          <w:p>
+            <w:pPr>
+              <w:jc w:val="center"/>
+            </w:pPr>
+            <w:r>
+              <w:t>진동/온도 데이터만 활용</w:t>
+            </w:r>
+          </w:p>
+        </w:tc>
+        <w:tc>
+          <w:tcPr>
+            <w:tcW w:type="dxa" w:w="2351"/>
+          </w:tcPr>
+          <w:p>
+            <w:pPr>
+              <w:jc w:val="center"/>
+            </w:pPr>
+            <w:r>
+              <w:t>설비 외관 이미지 + 센서 데이터 융합 진단</w:t>
+            </w:r>
+          </w:p>
+        </w:tc>
+      </w:tr>
+    </w:tbl>
+    <w:p>
+      <w:pPr>
+        <w:pStyle w:val="Heading2"/>
+      </w:pPr>
+      <w:r>
+        <w:t>10.3 단계별 로드맵</w:t>
+      </w:r>
+    </w:p>
+    <w:tbl>
+      <w:tblPr>
+        <w:tblStyle w:val="TableGrid"/>
+        <w:tblW w:type="auto" w:w="0"/>
+        <w:tblLook w:firstColumn="1" w:firstRow="1" w:lastColumn="0" w:lastRow="0" w:noHBand="0" w:noVBand="1" w:val="04A0"/>
+      </w:tblPr>
+      <w:tblGrid>
+        <w:gridCol w:w="2351"/>
+        <w:gridCol w:w="2351"/>
+        <w:gridCol w:w="2351"/>
+        <w:gridCol w:w="2351"/>
+      </w:tblGrid>
+      <w:tr>
+        <w:tc>
+          <w:tcPr>
+            <w:tcW w:type="dxa" w:w="2351"/>
+            <w:shd w:val="clear" w:color="auto" w:fill="4472C4"/>
+          </w:tcPr>
+          <w:p>
+            <w:pPr>
+              <w:jc w:val="center"/>
+            </w:pPr>
+            <w:r>
+              <w:rPr>
+                <w:b/>
+                <w:color w:val="FFFFFF"/>
+              </w:rPr>
+              <w:t>Phase</w:t>
+            </w:r>
+          </w:p>
+        </w:tc>
+        <w:tc>
+          <w:tcPr>
+            <w:tcW w:type="dxa" w:w="2351"/>
+            <w:shd w:val="clear" w:color="auto" w:fill="4472C4"/>
+          </w:tcPr>
+          <w:p>
+            <w:pPr>
+              <w:jc w:val="center"/>
+            </w:pPr>
+            <w:r>
+              <w:rPr>
+                <w:b/>
+                <w:color w:val="FFFFFF"/>
+              </w:rPr>
+              <w:t>기간</w:t>
+            </w:r>
+          </w:p>
+        </w:tc>
+        <w:tc>
+          <w:tcPr>
+            <w:tcW w:type="dxa" w:w="2351"/>
+            <w:shd w:val="clear" w:color="auto" w:fill="4472C4"/>
+          </w:tcPr>
+          <w:p>
+            <w:pPr>
+              <w:jc w:val="center"/>
+            </w:pPr>
+            <w:r>
+              <w:rPr>
+                <w:b/>
+                <w:color w:val="FFFFFF"/>
+              </w:rPr>
+              <w:t>목표</w:t>
+            </w:r>
+          </w:p>
+        </w:tc>
+        <w:tc>
+          <w:tcPr>
+            <w:tcW w:type="dxa" w:w="2351"/>
+            <w:shd w:val="clear" w:color="auto" w:fill="4472C4"/>
+          </w:tcPr>
+          <w:p>
+            <w:pPr>
+              <w:jc w:val="center"/>
+            </w:pPr>
+            <w:r>
+              <w:rPr>
+                <w:b/>
+                <w:color w:val="FFFFFF"/>
+              </w:rPr>
+              <w:t>핵심 기술</w:t>
+            </w:r>
+          </w:p>
+        </w:tc>
+      </w:tr>
+      <w:tr>
+        <w:tc>
+          <w:tcPr>
+            <w:tcW w:type="dxa" w:w="2351"/>
+            <w:shd w:val="clear" w:color="auto" w:fill="E2EFDA"/>
+          </w:tcPr>
+          <w:p>
+            <w:pPr>
+              <w:jc w:val="center"/>
+            </w:pPr>
+            <w:r>
+              <w:rPr>
+                <w:b/>
+              </w:rPr>
+              <w:t>Phase 1 (완료)</w:t>
+            </w:r>
+          </w:p>
+        </w:tc>
+        <w:tc>
+          <w:tcPr>
+            <w:tcW w:type="dxa" w:w="2351"/>
+            <w:shd w:val="clear" w:color="auto" w:fill="E2EFDA"/>
+          </w:tcPr>
+          <w:p>
+            <w:pPr>
+              <w:jc w:val="center"/>
+            </w:pPr>
+            <w:r>
+              <w:rPr>
+                <w:b/>
+              </w:rPr>
+              <w:t>현재</w:t>
+            </w:r>
+          </w:p>
+        </w:tc>
+        <w:tc>
+          <w:tcPr>
+            <w:tcW w:type="dxa" w:w="2351"/>
+            <w:shd w:val="clear" w:color="auto" w:fill="E2EFDA"/>
+          </w:tcPr>
+          <w:p>
+            <w:pPr>
+              <w:jc w:val="center"/>
+            </w:pPr>
+            <w:r>
+              <w:rPr>
+                <w:b/>
+              </w:rPr>
+              <w:t>ML+DL 통합 예지보전 시스템 구축</w:t>
+            </w:r>
+          </w:p>
+        </w:tc>
+        <w:tc>
+          <w:tcPr>
+            <w:tcW w:type="dxa" w:w="2351"/>
+            <w:shd w:val="clear" w:color="auto" w:fill="E2EFDA"/>
+          </w:tcPr>
+          <w:p>
+            <w:pPr>
+              <w:jc w:val="center"/>
+            </w:pPr>
+            <w:r>
+              <w:rPr>
+                <w:b/>
+              </w:rPr>
+              <w:t>LR + GRU + Streamlit 대시보드</w:t>
+            </w:r>
+          </w:p>
+        </w:tc>
+      </w:tr>
+      <w:tr>
+        <w:tc>
+          <w:tcPr>
+            <w:tcW w:type="dxa" w:w="2351"/>
+          </w:tcPr>
+          <w:p>
+            <w:pPr>
+              <w:jc w:val="center"/>
+            </w:pPr>
+            <w:r>
+              <w:t>Phase 2</w:t>
+            </w:r>
+          </w:p>
+        </w:tc>
+        <w:tc>
+          <w:tcPr>
+            <w:tcW w:type="dxa" w:w="2351"/>
+          </w:tcPr>
+          <w:p>
+            <w:pPr>
+              <w:jc w:val="center"/>
+            </w:pPr>
+            <w:r>
+              <w:t>단기 (1~3개월)</w:t>
+            </w:r>
+          </w:p>
+        </w:tc>
+        <w:tc>
+          <w:tcPr>
+            <w:tcW w:type="dxa" w:w="2351"/>
+          </w:tcPr>
+          <w:p>
+            <w:pPr>
+              <w:jc w:val="center"/>
+            </w:pPr>
+            <w:r>
+              <w:t>RAG 기반 유사 사례 검색 추가</w:t>
+            </w:r>
+          </w:p>
+        </w:tc>
+        <w:tc>
+          <w:tcPr>
+            <w:tcW w:type="dxa" w:w="2351"/>
+          </w:tcPr>
+          <w:p>
+            <w:pPr>
+              <w:jc w:val="center"/>
+            </w:pPr>
+            <w:r>
+              <w:t>벡터DB + Embedding + RAG 파이프라인</w:t>
+            </w:r>
+          </w:p>
+        </w:tc>
+      </w:tr>
+      <w:tr>
+        <w:tc>
+          <w:tcPr>
+            <w:tcW w:type="dxa" w:w="2351"/>
+          </w:tcPr>
+          <w:p>
+            <w:pPr>
+              <w:jc w:val="center"/>
+            </w:pPr>
+            <w:r>
+              <w:t>Phase 3</w:t>
+            </w:r>
+          </w:p>
+        </w:tc>
+        <w:tc>
+          <w:tcPr>
+            <w:tcW w:type="dxa" w:w="2351"/>
+          </w:tcPr>
+          <w:p>
+            <w:pPr>
+              <w:jc w:val="center"/>
+            </w:pPr>
+            <w:r>
+              <w:t>중기 (3~6개월)</w:t>
+            </w:r>
+          </w:p>
+        </w:tc>
+        <w:tc>
+          <w:tcPr>
+            <w:tcW w:type="dxa" w:w="2351"/>
+          </w:tcPr>
+          <w:p>
+            <w:pPr>
+              <w:jc w:val="center"/>
+            </w:pPr>
+            <w:r>
+              <w:t>LLM 자연어 진단 리포트 자동 생성</w:t>
+            </w:r>
+          </w:p>
+        </w:tc>
+        <w:tc>
+          <w:tcPr>
+            <w:tcW w:type="dxa" w:w="2351"/>
+          </w:tcPr>
+          <w:p>
+            <w:pPr>
+              <w:jc w:val="center"/>
+            </w:pPr>
+            <w:r>
+              <w:t>Claude/GPT API + Prompt Engineering</w:t>
+            </w:r>
+          </w:p>
+        </w:tc>
+      </w:tr>
+      <w:tr>
+        <w:tc>
+          <w:tcPr>
+            <w:tcW w:type="dxa" w:w="2351"/>
+          </w:tcPr>
+          <w:p>
+            <w:pPr>
+              <w:jc w:val="center"/>
+            </w:pPr>
+            <w:r>
+              <w:t>Phase 4</w:t>
+            </w:r>
+          </w:p>
+        </w:tc>
+        <w:tc>
+          <w:tcPr>
+            <w:tcW w:type="dxa" w:w="2351"/>
+          </w:tcPr>
+          <w:p>
+            <w:pPr>
+              <w:jc w:val="center"/>
+            </w:pPr>
+            <w:r>
+              <w:t>장기 (6개월+)</w:t>
+            </w:r>
+          </w:p>
+        </w:tc>
+        <w:tc>
+          <w:tcPr>
+            <w:tcW w:type="dxa" w:w="2351"/>
+          </w:tcPr>
+          <w:p>
+            <w:pPr>
+              <w:jc w:val="center"/>
+            </w:pPr>
+            <w:r>
+              <w:t>온라인 학습 + XAI + 멀티모달 통합</w:t>
+            </w:r>
+          </w:p>
+        </w:tc>
+        <w:tc>
+          <w:tcPr>
+            <w:tcW w:type="dxa" w:w="2351"/>
+          </w:tcPr>
+          <w:p>
+            <w:pPr>
+              <w:jc w:val="center"/>
+            </w:pPr>
+            <w:r>
+              <w:t>Continual Learning + SHAP + Vision</w:t>
+            </w:r>
+          </w:p>
+        </w:tc>
+      </w:tr>
+    </w:tbl>
     <w:sectPr>
       <w:pgSz w:w="12240" w:h="15840"/>
       <w:pgMar w:top="1134" w:right="1417" w:bottom="1134" w:left="1417" w:header="720" w:footer="720" w:gutter="0"/>

</xml_diff>